<commit_message>
Update dTech overview with latest version
🤖 Generated with [Claude Code](https://claude.com/claude-code)

Co-Authored-By: Claude Opus 4.5 <noreply@anthropic.com>
</commit_message>
<xml_diff>
--- a/dtech-overview.docx
+++ b/dtech-overview.docx
@@ -1,96 +1,27 @@
 
 <file path=word/document.xml><?xml version="1.0" encoding="utf-8"?>
-<w:document xmlns:mc="http://schemas.openxmlformats.org/markup-compatibility/2006" xmlns:o="urn:schemas-microsoft-com:office:office" xmlns:r="http://schemas.openxmlformats.org/officeDocument/2006/relationships" xmlns:m="http://schemas.openxmlformats.org/officeDocument/2006/math" xmlns:v="urn:schemas-microsoft-com:vml" xmlns:wp="http://schemas.openxmlformats.org/drawingml/2006/wordprocessingDrawing" xmlns:w10="urn:schemas-microsoft-com:office:word" xmlns:w="http://schemas.openxmlformats.org/wordprocessingml/2006/main" xmlns:wne="http://schemas.microsoft.com/office/word/2006/wordml" xmlns:sl="http://schemas.openxmlformats.org/schemaLibrary/2006/main" xmlns:a="http://schemas.openxmlformats.org/drawingml/2006/main" xmlns:pic="http://schemas.openxmlformats.org/drawingml/2006/picture" xmlns:c="http://schemas.openxmlformats.org/drawingml/2006/chart" xmlns:lc="http://schemas.openxmlformats.org/drawingml/2006/lockedCanvas" xmlns:dgm="http://schemas.openxmlformats.org/drawingml/2006/diagram" xmlns:wps="http://schemas.microsoft.com/office/word/2010/wordprocessingShape" xmlns:wpg="http://schemas.microsoft.com/office/word/2010/wordprocessingGroup" xmlns:w14="http://schemas.microsoft.com/office/word/2010/wordml" xmlns:w15="http://schemas.microsoft.com/office/word/2012/wordml" xmlns:w16="http://schemas.microsoft.com/office/word/2018/wordml" xmlns:w16cex="http://schemas.microsoft.com/office/word/2018/wordml/cex" xmlns:w16cid="http://schemas.microsoft.com/office/word/2016/wordml/cid" xmlns="http://schemas.microsoft.com/office/tasks/2019/documenttasks" xmlns:cr="http://schemas.microsoft.com/office/comments/2020/reactions">
+<w:document xmlns:wpc="http://schemas.microsoft.com/office/word/2010/wordprocessingCanvas" xmlns:cx="http://schemas.microsoft.com/office/drawing/2014/chartex" xmlns:cx1="http://schemas.microsoft.com/office/drawing/2015/9/8/chartex" xmlns:cx2="http://schemas.microsoft.com/office/drawing/2015/10/21/chartex" xmlns:cx3="http://schemas.microsoft.com/office/drawing/2016/5/9/chartex" xmlns:cx4="http://schemas.microsoft.com/office/drawing/2016/5/10/chartex" xmlns:cx5="http://schemas.microsoft.com/office/drawing/2016/5/11/chartex" xmlns:cx6="http://schemas.microsoft.com/office/drawing/2016/5/12/chartex" xmlns:cx7="http://schemas.microsoft.com/office/drawing/2016/5/13/chartex" xmlns:cx8="http://schemas.microsoft.com/office/drawing/2016/5/14/chartex" xmlns:mc="http://schemas.openxmlformats.org/markup-compatibility/2006" xmlns:aink="http://schemas.microsoft.com/office/drawing/2016/ink" xmlns:am3d="http://schemas.microsoft.com/office/drawing/2017/model3d" xmlns:o="urn:schemas-microsoft-com:office:office" xmlns:oel="http://schemas.microsoft.com/office/2019/extlst" xmlns:r="http://schemas.openxmlformats.org/officeDocument/2006/relationships" xmlns:m="http://schemas.openxmlformats.org/officeDocument/2006/math" xmlns:v="urn:schemas-microsoft-com:vml" xmlns:wp14="http://schemas.microsoft.com/office/word/2010/wordprocessingDrawing" xmlns:wp="http://schemas.openxmlformats.org/drawingml/2006/wordprocessingDrawing" xmlns:w10="urn:schemas-microsoft-com:office:word" xmlns:w="http://schemas.openxmlformats.org/wordprocessingml/2006/main" xmlns:w14="http://schemas.microsoft.com/office/word/2010/wordml" xmlns:w15="http://schemas.microsoft.com/office/word/2012/wordml" xmlns:w16cex="http://schemas.microsoft.com/office/word/2018/wordml/cex" xmlns:w16cid="http://schemas.microsoft.com/office/word/2016/wordml/cid" xmlns:w16="http://schemas.microsoft.com/office/word/2018/wordml" xmlns:w16sdtdh="http://schemas.microsoft.com/office/word/2020/wordml/sdtdatahash" xmlns:w16se="http://schemas.microsoft.com/office/word/2015/wordml/symex" xmlns:wpg="http://schemas.microsoft.com/office/word/2010/wordprocessingGroup" xmlns:wpi="http://schemas.microsoft.com/office/word/2010/wordprocessingInk" xmlns:wne="http://schemas.microsoft.com/office/word/2006/wordml" xmlns:wps="http://schemas.microsoft.com/office/word/2010/wordprocessingShape" mc:Ignorable="w14 w15 w16se w16cid w16 w16cex w16sdtdh wp14">
   <w:body>
-    <w:p>
-      <w:pPr>
-        <w:pStyle w:val="Title"/>
-        <w:keepNext w:val="0"/>
-        <w:keepLines w:val="0"/>
-        <w:pageBreakBefore w:val="0"/>
-        <w:widowControl w:val="0"/>
-        <w:pBdr>
-          <w:top w:space="0" w:sz="0" w:val="nil"/>
-          <w:left w:space="0" w:sz="0" w:val="nil"/>
-          <w:bottom w:space="0" w:sz="0" w:val="nil"/>
-          <w:right w:space="0" w:sz="0" w:val="nil"/>
-          <w:between w:space="0" w:sz="0" w:val="nil"/>
-        </w:pBdr>
-        <w:shd w:fill="auto" w:val="clear"/>
-        <w:spacing w:after="0" w:before="0" w:line="276" w:lineRule="auto"/>
-        <w:ind w:left="0" w:right="0" w:firstLine="0"/>
-        <w:jc w:val="left"/>
-        <w:rPr>
-          <w:rFonts w:ascii="Arial" w:cs="Arial" w:eastAsia="Arial" w:hAnsi="Arial"/>
-          <w:b w:val="0"/>
-          <w:bCs w:val="0"/>
-          <w:i w:val="0"/>
-          <w:iCs w:val="0"/>
-          <w:smallCaps w:val="0"/>
-          <w:strike w:val="0"/>
-          <w:color w:val="000000"/>
-          <w:sz w:val="22"/>
-          <w:szCs w:val="22"/>
-          <w:u w:val="none"/>
-          <w:shd w:fill="auto" w:val="clear"/>
-          <w:vertAlign w:val="baseline"/>
-        </w:rPr>
-        <w:sectPr>
-          <w:pgSz w:h="15840" w:w="12240" w:orient="portrait"/>
-          <w:pgMar w:bottom="1440" w:top="1440" w:left="1440" w:right="1440" w:header="720" w:footer="720"/>
-          <w:pgNumType w:start="1"/>
-        </w:sectPr>
-      </w:pPr>
-      <w:bookmarkStart w:colFirst="0" w:colLast="0" w:name="_nayplfbjr28g" w:id="0"/>
-      <w:bookmarkEnd w:id="0"/>
-      <w:r>
-        <w:rPr>
-          <w:rFonts w:ascii="Arial" w:cs="Arial" w:eastAsia="Arial" w:hAnsi="Arial"/>
-          <w:b w:val="0"/>
-          <w:bCs w:val="0"/>
-          <w:i w:val="0"/>
-          <w:iCs w:val="0"/>
-          <w:smallCaps w:val="0"/>
-          <w:strike w:val="0"/>
-          <w:color w:val="000000"/>
-          <w:sz w:val="52"/>
-          <w:szCs w:val="52"/>
-          <w:u w:val="none"/>
-          <w:shd w:fill="auto" w:val="clear"/>
-          <w:vertAlign w:val="baseline"/>
-          <w:rtl w:val="0"/>
-        </w:rPr>
-        <w:t xml:space="preserve">Tab 3</w:t>
-      </w:r>
-      <w:r>
-        <w:rPr>
-          <w:rtl w:val="0"/>
-        </w:rPr>
-      </w:r>
-    </w:p>
     <w:p>
       <w:pPr>
         <w:pStyle w:val="Heading2"/>
         <w:keepNext w:val="0"/>
         <w:keepLines w:val="0"/>
-        <w:spacing w:after="80" w:before="0" w:lineRule="auto"/>
+        <w:spacing w:before="0" w:after="80"/>
         <w:ind w:right="-450"/>
         <w:rPr>
-          <w:b w:val="1"/>
-          <w:bCs w:val="1"/>
+          <w:b/>
+          <w:bCs/>
           <w:sz w:val="34"/>
           <w:szCs w:val="34"/>
         </w:rPr>
       </w:pPr>
-      <w:bookmarkStart w:colFirst="0" w:colLast="0" w:name="_wu87lc9k1vx1" w:id="1"/>
-      <w:bookmarkEnd w:id="1"/>
-      <w:r>
-        <w:rPr>
-          <w:b w:val="1"/>
-          <w:bCs w:val="1"/>
+      <w:r>
+        <w:rPr>
+          <w:b/>
+          <w:bCs/>
           <w:sz w:val="34"/>
           <w:szCs w:val="34"/>
-          <w:rtl w:val="0"/>
         </w:rPr>
         <w:t xml:space="preserve">AI K12 Student Agency Award — Design Tech High School </w:t>
       </w:r>
@@ -100,27 +31,24 @@
         <w:pStyle w:val="Heading3"/>
         <w:keepNext w:val="0"/>
         <w:keepLines w:val="0"/>
-        <w:spacing w:before="280" w:lineRule="auto"/>
-        <w:rPr>
-          <w:b w:val="1"/>
-          <w:bCs w:val="1"/>
+        <w:spacing w:before="280"/>
+        <w:rPr>
+          <w:b/>
+          <w:bCs/>
           <w:color w:val="000000"/>
           <w:sz w:val="26"/>
           <w:szCs w:val="26"/>
         </w:rPr>
       </w:pPr>
-      <w:bookmarkStart w:colFirst="0" w:colLast="0" w:name="_xxs1jpcz67b7" w:id="2"/>
-      <w:bookmarkEnd w:id="2"/>
-      <w:r>
-        <w:rPr>
-          <w:b w:val="1"/>
-          <w:bCs w:val="1"/>
+      <w:r>
+        <w:rPr>
+          <w:b/>
+          <w:bCs/>
           <w:color w:val="000000"/>
           <w:sz w:val="26"/>
           <w:szCs w:val="26"/>
-          <w:rtl w:val="0"/>
-        </w:rPr>
-        <w:t xml:space="preserve">School snapshot</w:t>
+        </w:rPr>
+        <w:t>School snapshot</w:t>
       </w:r>
     </w:p>
     <w:p>
@@ -129,21 +57,16 @@
           <w:ilvl w:val="0"/>
           <w:numId w:val="7"/>
         </w:numPr>
-        <w:spacing w:after="0" w:afterAutospacing="0" w:before="240" w:lineRule="auto"/>
-        <w:ind w:left="720" w:hanging="360"/>
-      </w:pPr>
-      <w:r>
-        <w:rPr>
-          <w:b w:val="1"/>
-          <w:bCs w:val="1"/>
-          <w:rtl w:val="0"/>
-        </w:rPr>
-        <w:t xml:space="preserve">Address:</w:t>
-      </w:r>
-      <w:r>
-        <w:rPr>
-          <w:rtl w:val="0"/>
-        </w:rPr>
+        <w:spacing w:before="240"/>
+      </w:pPr>
+      <w:r>
+        <w:rPr>
+          <w:b/>
+          <w:bCs/>
+        </w:rPr>
+        <w:t>Address:</w:t>
+      </w:r>
+      <w:r>
         <w:t xml:space="preserve"> 275 Oracle Pkwy., Redwood City, CA 94065 | Phone: (650) 231-2701</w:t>
       </w:r>
     </w:p>
@@ -153,14 +76,9 @@
           <w:ilvl w:val="0"/>
           <w:numId w:val="7"/>
         </w:numPr>
-        <w:spacing w:after="0" w:afterAutospacing="0" w:before="0" w:beforeAutospacing="0" w:lineRule="auto"/>
-        <w:ind w:left="720" w:hanging="360"/>
-      </w:pPr>
-      <w:r>
-        <w:rPr>
-          <w:rtl w:val="0"/>
-        </w:rPr>
-        <w:t xml:space="preserve">Type: Public charter high school (grades 9–12), authorized by the San Mateo Union High School District</w:t>
+      </w:pPr>
+      <w:r>
+        <w:t>Type: Public charter high school (grades 9–12), authorized by the San Mateo Union High School District</w:t>
       </w:r>
     </w:p>
     <w:p>
@@ -169,37 +87,27 @@
           <w:ilvl w:val="0"/>
           <w:numId w:val="7"/>
         </w:numPr>
-        <w:spacing w:after="240" w:before="0" w:beforeAutospacing="0" w:lineRule="auto"/>
-        <w:ind w:left="720" w:hanging="360"/>
-      </w:pPr>
-      <w:r>
-        <w:rPr>
-          <w:b w:val="1"/>
-          <w:bCs w:val="1"/>
-          <w:rtl w:val="0"/>
-        </w:rPr>
-        <w:t xml:space="preserve">Enrollment:</w:t>
-      </w:r>
-      <w:r>
-        <w:rPr>
-          <w:rtl w:val="0"/>
-        </w:rPr>
+        <w:spacing w:after="240"/>
+      </w:pPr>
+      <w:r>
+        <w:rPr>
+          <w:b/>
+          <w:bCs/>
+        </w:rPr>
+        <w:t>Enrollment:</w:t>
+      </w:r>
+      <w:r>
         <w:t xml:space="preserve"> ~550 students</w:t>
       </w:r>
     </w:p>
     <w:p>
-      <w:pPr>
-        <w:rPr/>
-      </w:pPr>
-      <w:r>
-        <w:pict>
-          <v:rect style="width:0.0pt;height:1.5pt" o:hr="t" o:hrstd="t" o:hralign="center" fillcolor="#A0A0A0" stroked="f"/>
+      <w:r>
+        <w:rPr>
+          <w:noProof/>
+        </w:rPr>
+        <w:pict w14:anchorId="55A44937">
+          <v:rect id="_x0000_i1029" alt="" style="width:468pt;height:.05pt;mso-width-percent:0;mso-height-percent:0;mso-width-percent:0;mso-height-percent:0" o:hralign="center" o:hrstd="t" o:hr="t" fillcolor="#a0a0a0" stroked="f"/>
         </w:pict>
-      </w:r>
-      <w:r>
-        <w:rPr>
-          <w:rtl w:val="0"/>
-        </w:rPr>
       </w:r>
     </w:p>
     <w:p>
@@ -207,53 +115,41 @@
         <w:pStyle w:val="Heading2"/>
         <w:keepNext w:val="0"/>
         <w:keepLines w:val="0"/>
-        <w:spacing w:after="80" w:lineRule="auto"/>
+        <w:spacing w:after="80"/>
         <w:ind w:right="-810"/>
         <w:rPr>
-          <w:b w:val="1"/>
-          <w:bCs w:val="1"/>
+          <w:b/>
+          <w:bCs/>
           <w:sz w:val="34"/>
           <w:szCs w:val="34"/>
         </w:rPr>
       </w:pPr>
-      <w:bookmarkStart w:colFirst="0" w:colLast="0" w:name="_7fnzcph34oen" w:id="3"/>
-      <w:bookmarkEnd w:id="3"/>
-      <w:r>
-        <w:rPr>
-          <w:b w:val="1"/>
-          <w:bCs w:val="1"/>
+      <w:r>
+        <w:rPr>
+          <w:b/>
+          <w:bCs/>
           <w:sz w:val="34"/>
           <w:szCs w:val="34"/>
-          <w:rtl w:val="0"/>
-        </w:rPr>
-        <w:t xml:space="preserve">Our philosophy: AI as a human-centered design challenge</w:t>
-      </w:r>
-    </w:p>
-    <w:p>
-      <w:pPr>
-        <w:spacing w:after="240" w:before="240" w:lineRule="auto"/>
-        <w:rPr/>
-      </w:pPr>
-      <w:r>
-        <w:rPr>
-          <w:rtl w:val="0"/>
-        </w:rPr>
-        <w:t xml:space="preserve">We approach AI integration as an educational design challenge—not a compliance hurdle or a “tool rollout.” Our work is grounded in design thinking, building students’ capacity to empathize, define needs, prototype, test, and iterate. We lead with an exploration-first posture: build shared understanding, pilot safely, then codify norms and guardrails.</w:t>
-      </w:r>
-    </w:p>
-    <w:p>
-      <w:pPr>
-        <w:rPr/>
-      </w:pPr>
-      <w:r>
-        <w:pict>
-          <v:rect style="width:0.0pt;height:1.5pt" o:hr="t" o:hrstd="t" o:hralign="center" fillcolor="#A0A0A0" stroked="f"/>
+        </w:rPr>
+        <w:t>Our philosophy: AI as a human-centered design challenge</w:t>
+      </w:r>
+    </w:p>
+    <w:p>
+      <w:pPr>
+        <w:spacing w:before="240" w:after="240"/>
+      </w:pPr>
+      <w:r>
+        <w:t>We approach AI integration as an educational design challenge—not a compliance hurdle or a “tool rollout.” Our work is grounded in design thinking, building students’ capacity to empathize, define needs, prototype, test, and iterate. We lead with an exploration-first posture: build shared understanding, pilot safely, then codify norms and guardrails.</w:t>
+      </w:r>
+    </w:p>
+    <w:p>
+      <w:r>
+        <w:rPr>
+          <w:noProof/>
+        </w:rPr>
+        <w:pict w14:anchorId="158BCEA6">
+          <v:rect id="_x0000_i1028" alt="" style="width:468pt;height:.05pt;mso-width-percent:0;mso-height-percent:0;mso-width-percent:0;mso-height-percent:0" o:hralign="center" o:hrstd="t" o:hr="t" fillcolor="#a0a0a0" stroked="f"/>
         </w:pict>
-      </w:r>
-      <w:r>
-        <w:rPr>
-          <w:rtl w:val="0"/>
-        </w:rPr>
       </w:r>
     </w:p>
     <w:p>
@@ -261,25 +157,33 @@
         <w:pStyle w:val="Heading2"/>
         <w:keepNext w:val="0"/>
         <w:keepLines w:val="0"/>
-        <w:spacing w:after="80" w:lineRule="auto"/>
-        <w:rPr>
-          <w:b w:val="1"/>
-          <w:bCs w:val="1"/>
+        <w:spacing w:after="80"/>
+        <w:rPr>
+          <w:b/>
+          <w:bCs/>
           <w:sz w:val="34"/>
           <w:szCs w:val="34"/>
         </w:rPr>
       </w:pPr>
-      <w:bookmarkStart w:colFirst="0" w:colLast="0" w:name="_suk0l252cp7j" w:id="4"/>
-      <w:bookmarkEnd w:id="4"/>
-      <w:r>
-        <w:rPr>
-          <w:b w:val="1"/>
-          <w:bCs w:val="1"/>
+      <w:proofErr w:type="spellStart"/>
+      <w:r>
+        <w:rPr>
+          <w:b/>
+          <w:bCs/>
           <w:sz w:val="34"/>
           <w:szCs w:val="34"/>
-          <w:rtl w:val="0"/>
-        </w:rPr>
-        <w:t xml:space="preserve">d.Tech’s Approach</w:t>
+        </w:rPr>
+        <w:t>d.Tech’s</w:t>
+      </w:r>
+      <w:proofErr w:type="spellEnd"/>
+      <w:r>
+        <w:rPr>
+          <w:b/>
+          <w:bCs/>
+          <w:sz w:val="34"/>
+          <w:szCs w:val="34"/>
+        </w:rPr>
+        <w:t xml:space="preserve"> Approach</w:t>
       </w:r>
     </w:p>
     <w:p>
@@ -287,44 +191,40 @@
         <w:pStyle w:val="Heading3"/>
         <w:keepNext w:val="0"/>
         <w:keepLines w:val="0"/>
-        <w:spacing w:before="280" w:lineRule="auto"/>
-        <w:rPr>
-          <w:b w:val="1"/>
-          <w:bCs w:val="1"/>
+        <w:spacing w:before="280"/>
+        <w:rPr>
+          <w:b/>
+          <w:bCs/>
           <w:color w:val="000000"/>
           <w:sz w:val="26"/>
           <w:szCs w:val="26"/>
         </w:rPr>
       </w:pPr>
-      <w:bookmarkStart w:colFirst="0" w:colLast="0" w:name="_t3jkqp1rxs6o" w:id="5"/>
-      <w:bookmarkEnd w:id="5"/>
-      <w:r>
-        <w:rPr>
-          <w:b w:val="1"/>
-          <w:bCs w:val="1"/>
+      <w:r>
+        <w:rPr>
+          <w:b/>
+          <w:bCs/>
           <w:color w:val="000000"/>
           <w:sz w:val="26"/>
           <w:szCs w:val="26"/>
-          <w:rtl w:val="0"/>
-        </w:rPr>
-        <w:t xml:space="preserve">Human-first AI literacy (student agency + ethical judgment)</w:t>
-      </w:r>
-    </w:p>
-    <w:p>
-      <w:pPr>
-        <w:spacing w:after="240" w:before="240" w:lineRule="auto"/>
-        <w:rPr>
-          <w:b w:val="1"/>
-          <w:bCs w:val="1"/>
-        </w:rPr>
-      </w:pPr>
-      <w:r>
-        <w:rPr>
-          <w:b w:val="1"/>
-          <w:bCs w:val="1"/>
-          <w:rtl w:val="0"/>
-        </w:rPr>
-        <w:t xml:space="preserve">We teach students to:</w:t>
+        </w:rPr>
+        <w:t>Human-first AI literacy (student agency + ethical judgment)</w:t>
+      </w:r>
+    </w:p>
+    <w:p>
+      <w:pPr>
+        <w:spacing w:before="240" w:after="240"/>
+        <w:rPr>
+          <w:b/>
+          <w:bCs/>
+        </w:rPr>
+      </w:pPr>
+      <w:r>
+        <w:rPr>
+          <w:b/>
+          <w:bCs/>
+        </w:rPr>
+        <w:t>We teach students to:</w:t>
       </w:r>
     </w:p>
     <w:p>
@@ -333,14 +233,10 @@
           <w:ilvl w:val="0"/>
           <w:numId w:val="6"/>
         </w:numPr>
-        <w:spacing w:after="0" w:afterAutospacing="0" w:before="240" w:lineRule="auto"/>
-        <w:ind w:left="720" w:hanging="360"/>
-      </w:pPr>
-      <w:r>
-        <w:rPr>
-          <w:rtl w:val="0"/>
-        </w:rPr>
-        <w:t xml:space="preserve">Understand what AI is/isn’t (and how it can mislead)</w:t>
+        <w:spacing w:before="240"/>
+      </w:pPr>
+      <w:r>
+        <w:t>Understand what AI is/isn’t (and how it can mislead)</w:t>
       </w:r>
     </w:p>
     <w:p>
@@ -349,14 +245,9 @@
           <w:ilvl w:val="0"/>
           <w:numId w:val="6"/>
         </w:numPr>
-        <w:spacing w:after="0" w:afterAutospacing="0" w:before="0" w:beforeAutospacing="0" w:lineRule="auto"/>
-        <w:ind w:left="720" w:hanging="360"/>
-      </w:pPr>
-      <w:r>
-        <w:rPr>
-          <w:rtl w:val="0"/>
-        </w:rPr>
-        <w:t xml:space="preserve">Use AI as a thinking partner (not a shortcut)</w:t>
+      </w:pPr>
+      <w:r>
+        <w:t>Use AI as a thinking partner (not a shortcut)</w:t>
       </w:r>
     </w:p>
     <w:p>
@@ -365,15 +256,15 @@
           <w:ilvl w:val="0"/>
           <w:numId w:val="6"/>
         </w:numPr>
-        <w:spacing w:after="0" w:afterAutospacing="0" w:before="0" w:beforeAutospacing="0" w:lineRule="auto"/>
-        <w:ind w:left="720" w:hanging="360"/>
-      </w:pPr>
-      <w:r>
-        <w:rPr>
-          <w:rtl w:val="0"/>
-        </w:rPr>
-        <w:t xml:space="preserve">Evaluate outputs for bias, accuracy, and limitations</w:t>
-      </w:r>
+      </w:pPr>
+      <w:r>
+        <w:t xml:space="preserve">Evaluate outputs for bias, accuracy, and </w:t>
+      </w:r>
+      <w:proofErr w:type="gramStart"/>
+      <w:r>
+        <w:t>limitations</w:t>
+      </w:r>
+      <w:proofErr w:type="gramEnd"/>
     </w:p>
     <w:p>
       <w:pPr>
@@ -381,26 +272,23 @@
           <w:ilvl w:val="0"/>
           <w:numId w:val="6"/>
         </w:numPr>
-        <w:spacing w:after="240" w:before="0" w:beforeAutospacing="0" w:lineRule="auto"/>
-        <w:ind w:left="720" w:hanging="360"/>
-      </w:pPr>
-      <w:r>
-        <w:rPr>
-          <w:rtl w:val="0"/>
-        </w:rPr>
-        <w:t xml:space="preserve">Decide when AI supports learning vs. undermines authorship</w:t>
-      </w:r>
-    </w:p>
-    <w:p>
-      <w:pPr>
-        <w:spacing w:after="240" w:before="240" w:lineRule="auto"/>
-        <w:rPr/>
-      </w:pPr>
-      <w:r>
-        <w:rPr>
-          <w:rtl w:val="0"/>
-        </w:rPr>
-        <w:t xml:space="preserve">Our literacy goals align with human-centered frameworks including the OECD AI Principles (human rights/democratic values, transparency, robustness/safety, accountability).</w:t>
+        <w:spacing w:after="240"/>
+      </w:pPr>
+      <w:r>
+        <w:t xml:space="preserve">Decide when AI supports learning vs. undermines </w:t>
+      </w:r>
+      <w:proofErr w:type="gramStart"/>
+      <w:r>
+        <w:t>authorship</w:t>
+      </w:r>
+      <w:proofErr w:type="gramEnd"/>
+    </w:p>
+    <w:p>
+      <w:pPr>
+        <w:spacing w:before="240" w:after="240"/>
+      </w:pPr>
+      <w:r>
+        <w:t>Our literacy goals align with human-centered frameworks including the OECD AI Principles (human rights/democratic values, transparency, robustness/safety, accountability).</w:t>
       </w:r>
     </w:p>
     <w:p>
@@ -408,96 +296,94 @@
         <w:pStyle w:val="Heading3"/>
         <w:keepNext w:val="0"/>
         <w:keepLines w:val="0"/>
-        <w:spacing w:before="280" w:lineRule="auto"/>
-        <w:rPr>
-          <w:b w:val="1"/>
-          <w:bCs w:val="1"/>
+        <w:spacing w:before="280"/>
+        <w:rPr>
+          <w:b/>
+          <w:bCs/>
           <w:color w:val="000000"/>
           <w:sz w:val="26"/>
           <w:szCs w:val="26"/>
         </w:rPr>
       </w:pPr>
-      <w:bookmarkStart w:colFirst="0" w:colLast="0" w:name="_1gd4axona78i" w:id="6"/>
-      <w:bookmarkEnd w:id="6"/>
-      <w:r>
-        <w:rPr>
-          <w:b w:val="1"/>
-          <w:bCs w:val="1"/>
+      <w:r>
+        <w:rPr>
+          <w:b/>
+          <w:bCs/>
           <w:color w:val="000000"/>
           <w:sz w:val="26"/>
           <w:szCs w:val="26"/>
-          <w:rtl w:val="0"/>
-        </w:rPr>
-        <w:t xml:space="preserve">Repurposing school for “what’s next”</w:t>
-      </w:r>
-    </w:p>
-    <w:p>
-      <w:pPr>
-        <w:spacing w:after="240" w:before="240" w:lineRule="auto"/>
-        <w:rPr/>
-      </w:pPr>
-      <w:r>
-        <w:rPr>
-          <w:rtl w:val="0"/>
-        </w:rPr>
+        </w:rPr>
+        <w:t xml:space="preserve">Repurposing school for “what’s </w:t>
+      </w:r>
+      <w:proofErr w:type="gramStart"/>
+      <w:r>
+        <w:rPr>
+          <w:b/>
+          <w:bCs/>
+          <w:color w:val="000000"/>
+          <w:sz w:val="26"/>
+          <w:szCs w:val="26"/>
+        </w:rPr>
+        <w:t>next</w:t>
+      </w:r>
+      <w:proofErr w:type="gramEnd"/>
+      <w:r>
+        <w:rPr>
+          <w:b/>
+          <w:bCs/>
+          <w:color w:val="000000"/>
+          <w:sz w:val="26"/>
+          <w:szCs w:val="26"/>
+        </w:rPr>
+        <w:t>”</w:t>
+      </w:r>
+    </w:p>
+    <w:p>
+      <w:pPr>
+        <w:spacing w:before="240" w:after="240"/>
+      </w:pPr>
+      <w:r>
         <w:t xml:space="preserve">We aim for graduates who are </w:t>
       </w:r>
       <w:r>
         <w:rPr>
-          <w:b w:val="1"/>
-          <w:bCs w:val="1"/>
-          <w:rtl w:val="0"/>
-        </w:rPr>
-        <w:t xml:space="preserve">anchored</w:t>
-      </w:r>
-      <w:r>
-        <w:rPr>
-          <w:rtl w:val="0"/>
-        </w:rPr>
+          <w:b/>
+          <w:bCs/>
+        </w:rPr>
+        <w:t>anchored</w:t>
+      </w:r>
+      <w:r>
         <w:t xml:space="preserve"> (purpose and values), </w:t>
       </w:r>
       <w:r>
         <w:rPr>
-          <w:b w:val="1"/>
-          <w:bCs w:val="1"/>
-          <w:rtl w:val="0"/>
-        </w:rPr>
-        <w:t xml:space="preserve">adaptable</w:t>
-      </w:r>
-      <w:r>
-        <w:rPr>
-          <w:rtl w:val="0"/>
-        </w:rPr>
+          <w:b/>
+          <w:bCs/>
+        </w:rPr>
+        <w:t>adaptable</w:t>
+      </w:r>
+      <w:r>
         <w:t xml:space="preserve"> (problem-solving across contexts), and </w:t>
       </w:r>
       <w:r>
         <w:rPr>
-          <w:b w:val="1"/>
-          <w:bCs w:val="1"/>
-          <w:rtl w:val="0"/>
-        </w:rPr>
-        <w:t xml:space="preserve">human-centered</w:t>
-      </w:r>
-      <w:r>
-        <w:rPr>
-          <w:rtl w:val="0"/>
-        </w:rPr>
+          <w:b/>
+          <w:bCs/>
+        </w:rPr>
+        <w:t>human-centered</w:t>
+      </w:r>
+      <w:r>
         <w:t xml:space="preserve"> (relationships and ethical reasoning).</w:t>
       </w:r>
     </w:p>
     <w:p>
-      <w:pPr>
-        <w:rPr/>
-      </w:pPr>
-      <w:r>
-        <w:pict>
-          <v:rect style="width:0.0pt;height:1.5pt" o:hr="t" o:hrstd="t" o:hralign="center" fillcolor="#A0A0A0" stroked="f"/>
+      <w:r>
+        <w:rPr>
+          <w:noProof/>
+        </w:rPr>
+        <w:pict w14:anchorId="61669957">
+          <v:rect id="_x0000_i1027" alt="" style="width:468pt;height:.05pt;mso-width-percent:0;mso-height-percent:0;mso-width-percent:0;mso-height-percent:0" o:hralign="center" o:hrstd="t" o:hr="t" fillcolor="#a0a0a0" stroked="f"/>
         </w:pict>
-      </w:r>
-      <w:r>
-        <w:rPr>
-          <w:rtl w:val="0"/>
-        </w:rPr>
       </w:r>
     </w:p>
     <w:p>
@@ -505,43 +391,52 @@
         <w:pStyle w:val="Heading2"/>
         <w:keepNext w:val="0"/>
         <w:keepLines w:val="0"/>
-        <w:spacing w:after="80" w:lineRule="auto"/>
-        <w:rPr>
-          <w:b w:val="1"/>
-          <w:bCs w:val="1"/>
+        <w:spacing w:after="80"/>
+        <w:rPr>
+          <w:b/>
+          <w:bCs/>
           <w:sz w:val="34"/>
           <w:szCs w:val="34"/>
         </w:rPr>
       </w:pPr>
-      <w:bookmarkStart w:colFirst="0" w:colLast="0" w:name="_bz5f1oy1w2r2" w:id="7"/>
-      <w:bookmarkEnd w:id="7"/>
-      <w:r>
-        <w:rPr>
-          <w:rFonts w:ascii="Arial Unicode MS" w:cs="Arial Unicode MS" w:eastAsia="Arial Unicode MS" w:hAnsi="Arial Unicode MS"/>
-          <w:b w:val="1"/>
-          <w:bCs w:val="1"/>
+      <w:r>
+        <w:rPr>
+          <w:rFonts w:ascii="Arial Unicode MS" w:eastAsia="Arial Unicode MS" w:hAnsi="Arial Unicode MS" w:cs="Arial Unicode MS"/>
+          <w:b/>
+          <w:bCs/>
           <w:sz w:val="34"/>
           <w:szCs w:val="34"/>
-          <w:rtl w:val="0"/>
-        </w:rPr>
-        <w:t xml:space="preserve">Strategic Framework: Explore → Create → Learn</w:t>
-      </w:r>
-    </w:p>
-    <w:p>
-      <w:pPr>
-        <w:spacing w:after="240" w:before="240" w:lineRule="auto"/>
-        <w:rPr>
-          <w:b w:val="1"/>
-          <w:bCs w:val="1"/>
-        </w:rPr>
-      </w:pPr>
-      <w:r>
-        <w:rPr>
-          <w:b w:val="1"/>
-          <w:bCs w:val="1"/>
-          <w:rtl w:val="0"/>
-        </w:rPr>
-        <w:t xml:space="preserve">EXPLORE (build literacy + safe pilots)</w:t>
+        </w:rPr>
+        <w:t xml:space="preserve">Strategic Framework: Explore → Create → </w:t>
+      </w:r>
+      <w:proofErr w:type="gramStart"/>
+      <w:r>
+        <w:rPr>
+          <w:rFonts w:ascii="Arial Unicode MS" w:eastAsia="Arial Unicode MS" w:hAnsi="Arial Unicode MS" w:cs="Arial Unicode MS"/>
+          <w:b/>
+          <w:bCs/>
+          <w:sz w:val="34"/>
+          <w:szCs w:val="34"/>
+        </w:rPr>
+        <w:t>Learn</w:t>
+      </w:r>
+      <w:proofErr w:type="gramEnd"/>
+    </w:p>
+    <w:p>
+      <w:pPr>
+        <w:spacing w:before="240" w:after="240"/>
+        <w:rPr>
+          <w:b/>
+          <w:bCs/>
+        </w:rPr>
+      </w:pPr>
+      <w:r>
+        <w:rPr>
+          <w:b/>
+          <w:bCs/>
+        </w:rPr>
+        <w:lastRenderedPageBreak/>
+        <w:t>EXPLORE (build literacy + safe pilots)</w:t>
       </w:r>
     </w:p>
     <w:p>
@@ -550,14 +445,18 @@
           <w:ilvl w:val="0"/>
           <w:numId w:val="1"/>
         </w:numPr>
-        <w:spacing w:after="0" w:afterAutospacing="0" w:before="240" w:lineRule="auto"/>
-        <w:ind w:left="720" w:hanging="360"/>
-      </w:pPr>
-      <w:r>
-        <w:rPr>
-          <w:rtl w:val="0"/>
-        </w:rPr>
-        <w:t xml:space="preserve">Commissioned an AI Partnerships Coordinator to lead in partner-based experimentation with various industry partners, including Playlab (steerable, customizable safeguards)</w:t>
+        <w:spacing w:before="240"/>
+      </w:pPr>
+      <w:r>
+        <w:t xml:space="preserve">Commissioned an AI Partnerships Coordinator to lead in partner-based experimentation with various industry partners, including </w:t>
+      </w:r>
+      <w:proofErr w:type="spellStart"/>
+      <w:r>
+        <w:t>Playlab</w:t>
+      </w:r>
+      <w:proofErr w:type="spellEnd"/>
+      <w:r>
+        <w:t xml:space="preserve"> (steerable, customizable safeguards)</w:t>
       </w:r>
     </w:p>
     <w:p>
@@ -566,14 +465,25 @@
           <w:ilvl w:val="0"/>
           <w:numId w:val="1"/>
         </w:numPr>
-        <w:spacing w:after="0" w:afterAutospacing="0" w:before="0" w:beforeAutospacing="0" w:lineRule="auto"/>
-        <w:ind w:left="720" w:hanging="360"/>
-      </w:pPr>
-      <w:r>
-        <w:rPr>
-          <w:rtl w:val="0"/>
-        </w:rPr>
-        <w:t xml:space="preserve">Learning experiences connected to Stanford’s AI Tinkery (hands-on exploration of genAI for learning)</w:t>
+      </w:pPr>
+      <w:r>
+        <w:t xml:space="preserve">Learning experiences connected to Stanford’s AI </w:t>
+      </w:r>
+      <w:proofErr w:type="spellStart"/>
+      <w:r>
+        <w:t>Tinkery</w:t>
+      </w:r>
+      <w:proofErr w:type="spellEnd"/>
+      <w:r>
+        <w:t xml:space="preserve"> (hands-on exploration of </w:t>
+      </w:r>
+      <w:proofErr w:type="spellStart"/>
+      <w:r>
+        <w:t>genAI</w:t>
+      </w:r>
+      <w:proofErr w:type="spellEnd"/>
+      <w:r>
+        <w:t xml:space="preserve"> for learning)</w:t>
       </w:r>
     </w:p>
     <w:p>
@@ -582,14 +492,17 @@
           <w:ilvl w:val="0"/>
           <w:numId w:val="1"/>
         </w:numPr>
-        <w:spacing w:after="0" w:afterAutospacing="0" w:before="0" w:beforeAutospacing="0" w:lineRule="auto"/>
-        <w:ind w:left="720" w:hanging="360"/>
-      </w:pPr>
-      <w:r>
-        <w:rPr>
-          <w:rtl w:val="0"/>
-        </w:rPr>
-        <w:t xml:space="preserve">Human-connection lens through The Rithm Project</w:t>
+      </w:pPr>
+      <w:r>
+        <w:t xml:space="preserve">Human-connection lens through The </w:t>
+      </w:r>
+      <w:proofErr w:type="spellStart"/>
+      <w:r>
+        <w:t>Rithm</w:t>
+      </w:r>
+      <w:proofErr w:type="spellEnd"/>
+      <w:r>
+        <w:t xml:space="preserve"> Project</w:t>
       </w:r>
     </w:p>
     <w:p>
@@ -598,14 +511,9 @@
           <w:ilvl w:val="0"/>
           <w:numId w:val="1"/>
         </w:numPr>
-        <w:spacing w:after="0" w:afterAutospacing="0" w:before="0" w:beforeAutospacing="0" w:lineRule="auto"/>
-        <w:ind w:left="720" w:hanging="360"/>
-      </w:pPr>
-      <w:r>
-        <w:rPr>
-          <w:rtl w:val="0"/>
-        </w:rPr>
-        <w:t xml:space="preserve">Community support provided by the Oracle Education Foundation</w:t>
+      </w:pPr>
+      <w:r>
+        <w:t>Community support provided by the Oracle Education Foundation</w:t>
       </w:r>
     </w:p>
     <w:p>
@@ -614,14 +522,10 @@
           <w:ilvl w:val="0"/>
           <w:numId w:val="1"/>
         </w:numPr>
-        <w:spacing w:after="0" w:afterAutospacing="0" w:before="0" w:beforeAutospacing="0" w:lineRule="auto"/>
-        <w:ind w:left="720" w:right="-360" w:hanging="360"/>
-      </w:pPr>
-      <w:r>
-        <w:rPr>
-          <w:rtl w:val="0"/>
-        </w:rPr>
-        <w:t xml:space="preserve">Staff capacity-building through AI PD and communities of practice (e.g., ISTE AI Deep Dive)</w:t>
+        <w:ind w:right="-360"/>
+      </w:pPr>
+      <w:r>
+        <w:t>Staff capacity-building through AI PD and communities of practice (e.g., ISTE AI Deep Dive)</w:t>
       </w:r>
     </w:p>
     <w:p>
@@ -630,59 +534,67 @@
           <w:ilvl w:val="0"/>
           <w:numId w:val="1"/>
         </w:numPr>
-        <w:spacing w:after="240" w:before="0" w:beforeAutospacing="0" w:lineRule="auto"/>
-        <w:ind w:left="720" w:hanging="360"/>
-      </w:pPr>
-      <w:r>
-        <w:rPr>
-          <w:rtl w:val="0"/>
-        </w:rPr>
-        <w:t xml:space="preserve">d.tech offerings (school-developed): </w:t>
-      </w:r>
-      <w:r>
-        <w:rPr>
-          <w:i w:val="1"/>
-          <w:iCs w:val="1"/>
-          <w:rtl w:val="0"/>
-        </w:rPr>
-        <w:t xml:space="preserve">AI Literacy &amp; Human Agency</w:t>
-      </w:r>
-      <w:r>
-        <w:rPr>
-          <w:rtl w:val="0"/>
-        </w:rPr>
+        <w:spacing w:after="240"/>
+      </w:pPr>
+      <w:proofErr w:type="spellStart"/>
+      <w:r>
+        <w:t>d.tech</w:t>
+      </w:r>
+      <w:proofErr w:type="spellEnd"/>
+      <w:r>
+        <w:t xml:space="preserve"> offerings (school-developed): </w:t>
+      </w:r>
+      <w:r>
+        <w:rPr>
+          <w:i/>
+          <w:iCs/>
+        </w:rPr>
+        <w:t>AI Literacy &amp; Human Agency</w:t>
+      </w:r>
+      <w:r>
         <w:t xml:space="preserve"> intersession course; </w:t>
       </w:r>
       <w:r>
         <w:rPr>
-          <w:i w:val="1"/>
-          <w:iCs w:val="1"/>
-          <w:rtl w:val="0"/>
-        </w:rPr>
-        <w:t xml:space="preserve">AI Vibe Coding</w:t>
-      </w:r>
-      <w:r>
-        <w:rPr>
-          <w:rtl w:val="0"/>
-        </w:rPr>
-        <w:t xml:space="preserve"> intersession course; staff PD sessions facilitated with partners including Rithim Project, PlayLab, aiEDU and Inspirit AI.</w:t>
-      </w:r>
-    </w:p>
-    <w:p>
-      <w:pPr>
-        <w:spacing w:after="240" w:before="240" w:lineRule="auto"/>
-        <w:rPr>
-          <w:b w:val="1"/>
-          <w:bCs w:val="1"/>
-        </w:rPr>
-      </w:pPr>
-      <w:r>
-        <w:rPr>
-          <w:b w:val="1"/>
-          <w:bCs w:val="1"/>
-          <w:rtl w:val="0"/>
-        </w:rPr>
-        <w:t xml:space="preserve">CREATE (codify norms + structures)</w:t>
+          <w:i/>
+          <w:iCs/>
+        </w:rPr>
+        <w:t>AI Vibe Coding</w:t>
+      </w:r>
+      <w:r>
+        <w:t xml:space="preserve"> intersession course; staff PD sessions facilitated with partners including </w:t>
+      </w:r>
+      <w:proofErr w:type="spellStart"/>
+      <w:r>
+        <w:t>Rithim</w:t>
+      </w:r>
+      <w:proofErr w:type="spellEnd"/>
+      <w:r>
+        <w:t xml:space="preserve"> Project, PlayLab, </w:t>
+      </w:r>
+      <w:proofErr w:type="spellStart"/>
+      <w:r>
+        <w:t>aiEDU</w:t>
+      </w:r>
+      <w:proofErr w:type="spellEnd"/>
+      <w:r>
+        <w:t xml:space="preserve"> and Inspirit AI.</w:t>
+      </w:r>
+    </w:p>
+    <w:p>
+      <w:pPr>
+        <w:spacing w:before="240" w:after="240"/>
+        <w:rPr>
+          <w:b/>
+          <w:bCs/>
+        </w:rPr>
+      </w:pPr>
+      <w:r>
+        <w:rPr>
+          <w:b/>
+          <w:bCs/>
+        </w:rPr>
+        <w:t>CREATE (codify norms + structures)</w:t>
       </w:r>
     </w:p>
     <w:p>
@@ -691,14 +603,10 @@
           <w:ilvl w:val="0"/>
           <w:numId w:val="4"/>
         </w:numPr>
-        <w:spacing w:after="0" w:afterAutospacing="0" w:before="240" w:lineRule="auto"/>
-        <w:ind w:left="720" w:hanging="360"/>
-      </w:pPr>
-      <w:r>
-        <w:rPr>
-          <w:rtl w:val="0"/>
-        </w:rPr>
-        <w:t xml:space="preserve">A student-informed, staff-developed AI Framework</w:t>
+        <w:spacing w:before="240"/>
+      </w:pPr>
+      <w:r>
+        <w:t>A student-informed, staff-developed AI Framework</w:t>
       </w:r>
     </w:p>
     <w:p>
@@ -707,14 +615,9 @@
           <w:ilvl w:val="0"/>
           <w:numId w:val="4"/>
         </w:numPr>
-        <w:spacing w:after="0" w:afterAutospacing="0" w:before="0" w:beforeAutospacing="0" w:lineRule="auto"/>
-        <w:ind w:left="720" w:hanging="360"/>
-      </w:pPr>
-      <w:r>
-        <w:rPr>
-          <w:rtl w:val="0"/>
-        </w:rPr>
-        <w:t xml:space="preserve">Schoolwide norms: AI as a learning amplifier, not a replacement for thinking/authorship</w:t>
+      </w:pPr>
+      <w:r>
+        <w:t>Schoolwide norms: AI as a learning amplifier, not a replacement for thinking/authorship</w:t>
       </w:r>
     </w:p>
     <w:p>
@@ -723,31 +626,26 @@
           <w:ilvl w:val="0"/>
           <w:numId w:val="4"/>
         </w:numPr>
-        <w:spacing w:after="240" w:before="0" w:beforeAutospacing="0" w:lineRule="auto"/>
-        <w:ind w:left="720" w:hanging="360"/>
-      </w:pPr>
-      <w:r>
-        <w:rPr>
-          <w:rtl w:val="0"/>
-        </w:rPr>
-        <w:t xml:space="preserve">Classroom expectations for process evidence, reflection, and appropriate attribution</w:t>
-      </w:r>
-    </w:p>
-    <w:p>
-      <w:pPr>
-        <w:spacing w:after="240" w:before="240" w:lineRule="auto"/>
-        <w:rPr>
-          <w:b w:val="1"/>
-          <w:bCs w:val="1"/>
-        </w:rPr>
-      </w:pPr>
-      <w:r>
-        <w:rPr>
-          <w:b w:val="1"/>
-          <w:bCs w:val="1"/>
-          <w:rtl w:val="0"/>
-        </w:rPr>
-        <w:t xml:space="preserve">LEARN (iterate in real classrooms)</w:t>
+        <w:spacing w:after="240"/>
+      </w:pPr>
+      <w:r>
+        <w:t>Classroom expectations for process evidence, reflection, and appropriate attribution</w:t>
+      </w:r>
+    </w:p>
+    <w:p>
+      <w:pPr>
+        <w:spacing w:before="240" w:after="240"/>
+        <w:rPr>
+          <w:b/>
+          <w:bCs/>
+        </w:rPr>
+      </w:pPr>
+      <w:r>
+        <w:rPr>
+          <w:b/>
+          <w:bCs/>
+        </w:rPr>
+        <w:t>LEARN (iterate in real classrooms)</w:t>
       </w:r>
     </w:p>
     <w:p>
@@ -756,29 +654,20 @@
           <w:ilvl w:val="0"/>
           <w:numId w:val="5"/>
         </w:numPr>
-        <w:spacing w:after="240" w:before="240" w:lineRule="auto"/>
-        <w:ind w:left="720" w:hanging="360"/>
-      </w:pPr>
-      <w:r>
-        <w:rPr>
-          <w:rtl w:val="0"/>
-        </w:rPr>
-        <w:t xml:space="preserve">Continuous improvement: tighten scaffolds where gaps widen; refine what increases agency.</w:t>
-      </w:r>
-    </w:p>
-    <w:p>
-      <w:pPr>
-        <w:rPr/>
-      </w:pPr>
-      <w:r>
-        <w:pict>
-          <v:rect style="width:0.0pt;height:1.5pt" o:hr="t" o:hrstd="t" o:hralign="center" fillcolor="#A0A0A0" stroked="f"/>
+        <w:spacing w:before="240" w:after="240"/>
+      </w:pPr>
+      <w:r>
+        <w:t>Continuous improvement: tighten scaffolds where gaps widen; refine what increases agency.</w:t>
+      </w:r>
+    </w:p>
+    <w:p>
+      <w:r>
+        <w:rPr>
+          <w:noProof/>
+        </w:rPr>
+        <w:pict w14:anchorId="2EE7CEFA">
+          <v:rect id="_x0000_i1026" alt="" style="width:468pt;height:.05pt;mso-width-percent:0;mso-height-percent:0;mso-width-percent:0;mso-height-percent:0" o:hralign="center" o:hrstd="t" o:hr="t" fillcolor="#a0a0a0" stroked="f"/>
         </w:pict>
-      </w:r>
-      <w:r>
-        <w:rPr>
-          <w:rtl w:val="0"/>
-        </w:rPr>
       </w:r>
     </w:p>
     <w:p>
@@ -786,23 +675,20 @@
         <w:pStyle w:val="Heading2"/>
         <w:keepNext w:val="0"/>
         <w:keepLines w:val="0"/>
-        <w:spacing w:after="80" w:lineRule="auto"/>
-        <w:rPr>
-          <w:b w:val="1"/>
-          <w:bCs w:val="1"/>
+        <w:spacing w:after="80"/>
+        <w:rPr>
+          <w:b/>
+          <w:bCs/>
           <w:sz w:val="34"/>
           <w:szCs w:val="34"/>
         </w:rPr>
       </w:pPr>
-      <w:bookmarkStart w:colFirst="0" w:colLast="0" w:name="_3a9ejjqrbq32" w:id="8"/>
-      <w:bookmarkEnd w:id="8"/>
-      <w:r>
-        <w:rPr>
-          <w:b w:val="1"/>
-          <w:bCs w:val="1"/>
+      <w:r>
+        <w:rPr>
+          <w:b/>
+          <w:bCs/>
           <w:sz w:val="34"/>
           <w:szCs w:val="34"/>
-          <w:rtl w:val="0"/>
         </w:rPr>
         <w:t xml:space="preserve">Equity &amp; Ethics: </w:t>
       </w:r>
@@ -813,14 +699,18 @@
           <w:ilvl w:val="0"/>
           <w:numId w:val="2"/>
         </w:numPr>
-        <w:spacing w:after="0" w:afterAutospacing="0" w:before="240" w:lineRule="auto"/>
-        <w:ind w:left="720" w:hanging="360"/>
-      </w:pPr>
-      <w:r>
-        <w:rPr>
-          <w:rtl w:val="0"/>
-        </w:rPr>
-        <w:t xml:space="preserve">Prefer sandboxed tools and clear boundaries to protect privacy and reduce risk (e.g., Playlab guardrails)</w:t>
+        <w:spacing w:before="240"/>
+      </w:pPr>
+      <w:r>
+        <w:t xml:space="preserve">Prefer sandboxed tools and clear boundaries to protect privacy and reduce risk (e.g., </w:t>
+      </w:r>
+      <w:proofErr w:type="spellStart"/>
+      <w:r>
+        <w:t>Playlab</w:t>
+      </w:r>
+      <w:proofErr w:type="spellEnd"/>
+      <w:r>
+        <w:t xml:space="preserve"> guardrails)</w:t>
       </w:r>
     </w:p>
     <w:p>
@@ -829,29 +719,20 @@
           <w:ilvl w:val="0"/>
           <w:numId w:val="2"/>
         </w:numPr>
-        <w:spacing w:after="240" w:before="0" w:beforeAutospacing="0" w:lineRule="auto"/>
-        <w:ind w:left="720" w:hanging="360"/>
-      </w:pPr>
-      <w:r>
-        <w:rPr>
-          <w:rtl w:val="0"/>
-        </w:rPr>
-        <w:t xml:space="preserve">Explicit instruction on “AI for thinking” vs. “AI for finishing” so all students build durable judgment—not dependency.</w:t>
-      </w:r>
-    </w:p>
-    <w:p>
-      <w:pPr>
-        <w:rPr/>
-      </w:pPr>
-      <w:r>
-        <w:pict>
-          <v:rect style="width:0.0pt;height:1.5pt" o:hr="t" o:hrstd="t" o:hralign="center" fillcolor="#A0A0A0" stroked="f"/>
+        <w:spacing w:after="240"/>
+      </w:pPr>
+      <w:r>
+        <w:t>Explicit instruction on “AI for thinking” vs. “AI for finishing” so all students build durable judgment—not dependency.</w:t>
+      </w:r>
+    </w:p>
+    <w:p>
+      <w:r>
+        <w:rPr>
+          <w:noProof/>
+        </w:rPr>
+        <w:pict w14:anchorId="1D8C3142">
+          <v:rect id="_x0000_i1025" alt="" style="width:468pt;height:.05pt;mso-width-percent:0;mso-height-percent:0;mso-width-percent:0;mso-height-percent:0" o:hralign="center" o:hrstd="t" o:hr="t" fillcolor="#a0a0a0" stroked="f"/>
         </w:pict>
-      </w:r>
-      <w:r>
-        <w:rPr>
-          <w:rtl w:val="0"/>
-        </w:rPr>
       </w:r>
     </w:p>
     <w:p>
@@ -859,23 +740,20 @@
         <w:pStyle w:val="Heading2"/>
         <w:keepNext w:val="0"/>
         <w:keepLines w:val="0"/>
-        <w:spacing w:after="80" w:lineRule="auto"/>
-        <w:rPr>
-          <w:b w:val="1"/>
-          <w:bCs w:val="1"/>
+        <w:spacing w:after="80"/>
+        <w:rPr>
+          <w:b/>
+          <w:bCs/>
           <w:sz w:val="34"/>
           <w:szCs w:val="34"/>
         </w:rPr>
       </w:pPr>
-      <w:bookmarkStart w:colFirst="0" w:colLast="0" w:name="_4h2ylup27o2s" w:id="9"/>
-      <w:bookmarkEnd w:id="9"/>
-      <w:r>
-        <w:rPr>
-          <w:b w:val="1"/>
-          <w:bCs w:val="1"/>
+      <w:r>
+        <w:rPr>
+          <w:b/>
+          <w:bCs/>
           <w:sz w:val="34"/>
           <w:szCs w:val="34"/>
-          <w:rtl w:val="0"/>
         </w:rPr>
         <w:t xml:space="preserve">Replication: </w:t>
       </w:r>
@@ -886,14 +764,10 @@
           <w:ilvl w:val="0"/>
           <w:numId w:val="3"/>
         </w:numPr>
-        <w:spacing w:after="0" w:afterAutospacing="0" w:before="240" w:lineRule="auto"/>
-        <w:ind w:left="720" w:hanging="360"/>
-      </w:pPr>
-      <w:r>
-        <w:rPr>
-          <w:rtl w:val="0"/>
-        </w:rPr>
-        <w:t xml:space="preserve">Explore before you enforce (using shared literacy standards and + safe pilots).</w:t>
+        <w:spacing w:before="240"/>
+      </w:pPr>
+      <w:r>
+        <w:t>Explore before you enforce (using shared literacy standards and + safe pilots).</w:t>
       </w:r>
     </w:p>
     <w:p>
@@ -902,14 +776,10 @@
           <w:ilvl w:val="0"/>
           <w:numId w:val="3"/>
         </w:numPr>
-        <w:spacing w:after="0" w:afterAutospacing="0" w:before="0" w:beforeAutospacing="0" w:lineRule="auto"/>
-        <w:ind w:left="720" w:right="-1440" w:hanging="360"/>
-      </w:pPr>
-      <w:r>
-        <w:rPr>
-          <w:rtl w:val="0"/>
-        </w:rPr>
-        <w:t xml:space="preserve">Make student partnership structural (co-design frameworks; in the decision-making process).</w:t>
+        <w:ind w:right="-1440"/>
+      </w:pPr>
+      <w:r>
+        <w:t>Make student partnership structural (co-design frameworks; in the decision-making process).</w:t>
       </w:r>
     </w:p>
     <w:p>
@@ -918,30 +788,46 @@
           <w:ilvl w:val="0"/>
           <w:numId w:val="3"/>
         </w:numPr>
-        <w:spacing w:after="240" w:before="0" w:beforeAutospacing="0" w:lineRule="auto"/>
-        <w:ind w:left="720" w:right="-720" w:hanging="360"/>
-      </w:pPr>
-      <w:r>
-        <w:rPr>
-          <w:rtl w:val="0"/>
-        </w:rPr>
-        <w:t xml:space="preserve">Standardize “AI as amplifier” practices (teach when AI strengthens vs. undermines learning.</w:t>
-        <w:br w:type="textWrapping"/>
-      </w:r>
+        <w:spacing w:after="240"/>
+        <w:ind w:right="-720"/>
+        <w:sectPr>
+          <w:pgSz w:w="12240" w:h="15840"/>
+          <w:pgMar w:top="1440" w:right="1440" w:bottom="1440" w:left="1440" w:header="720" w:footer="720" w:gutter="0"/>
+          <w:pgNumType w:start="1"/>
+          <w:cols w:space="720"/>
+        </w:sectPr>
+      </w:pPr>
+      <w:r>
+        <w:t>Standardize “AI as amplifier” practices (teach when AI strengthens vs. undermines learning.</w:t>
+      </w:r>
+      <w:r>
+        <w:br/>
+      </w:r>
+    </w:p>
+    <w:p>
+      <w:pPr>
+        <w:spacing w:after="240"/>
+        <w:ind w:right="-720"/>
+      </w:pPr>
+      <w:bookmarkStart w:id="0" w:name="_wu87lc9k1vx1" w:colFirst="0" w:colLast="0"/>
+      <w:bookmarkEnd w:id="0"/>
     </w:p>
     <w:sectPr>
-      <w:type w:val="nextPage"/>
-      <w:pgSz w:h="15840" w:w="12240" w:orient="portrait"/>
-      <w:pgMar w:bottom="1440" w:top="1440" w:left="1440" w:right="1440" w:header="720" w:footer="720"/>
+      <w:pgSz w:w="12240" w:h="15840"/>
+      <w:pgMar w:top="1440" w:right="1440" w:bottom="1440" w:left="1440" w:header="720" w:footer="720" w:gutter="0"/>
       <w:pgNumType w:start="1"/>
+      <w:cols w:space="720"/>
     </w:sectPr>
   </w:body>
 </w:document>
 </file>
 
 <file path=word/numbering.xml><?xml version="1.0" encoding="utf-8"?>
-<w:numbering xmlns:mc="http://schemas.openxmlformats.org/markup-compatibility/2006" xmlns:o="urn:schemas-microsoft-com:office:office" xmlns:r="http://schemas.openxmlformats.org/officeDocument/2006/relationships" xmlns:m="http://schemas.openxmlformats.org/officeDocument/2006/math" xmlns:v="urn:schemas-microsoft-com:vml" xmlns:wp="http://schemas.openxmlformats.org/drawingml/2006/wordprocessingDrawing" xmlns:w10="urn:schemas-microsoft-com:office:word" xmlns:w="http://schemas.openxmlformats.org/wordprocessingml/2006/main" xmlns:wne="http://schemas.microsoft.com/office/word/2006/wordml" xmlns:sl="http://schemas.openxmlformats.org/schemaLibrary/2006/main" xmlns:a="http://schemas.openxmlformats.org/drawingml/2006/main" xmlns:pic="http://schemas.openxmlformats.org/drawingml/2006/picture" xmlns:c="http://schemas.openxmlformats.org/drawingml/2006/chart" xmlns:lc="http://schemas.openxmlformats.org/drawingml/2006/lockedCanvas" xmlns:dgm="http://schemas.openxmlformats.org/drawingml/2006/diagram" xmlns:wps="http://schemas.microsoft.com/office/word/2010/wordprocessingShape" xmlns:wpg="http://schemas.microsoft.com/office/word/2010/wordprocessingGroup" xmlns:w14="http://schemas.microsoft.com/office/word/2010/wordml" xmlns:w15="http://schemas.microsoft.com/office/word/2012/wordml" xmlns:w16="http://schemas.microsoft.com/office/word/2018/wordml" xmlns:w16cex="http://schemas.microsoft.com/office/word/2018/wordml/cex" xmlns:w16cid="http://schemas.microsoft.com/office/word/2016/wordml/cid" xmlns="http://schemas.microsoft.com/office/tasks/2019/documenttasks" xmlns:cr="http://schemas.microsoft.com/office/comments/2020/reactions">
-  <w:abstractNum w:abstractNumId="1">
+<w:numbering xmlns:wpc="http://schemas.microsoft.com/office/word/2010/wordprocessingCanvas" xmlns:cx="http://schemas.microsoft.com/office/drawing/2014/chartex" xmlns:cx1="http://schemas.microsoft.com/office/drawing/2015/9/8/chartex" xmlns:cx2="http://schemas.microsoft.com/office/drawing/2015/10/21/chartex" xmlns:cx3="http://schemas.microsoft.com/office/drawing/2016/5/9/chartex" xmlns:cx4="http://schemas.microsoft.com/office/drawing/2016/5/10/chartex" xmlns:cx5="http://schemas.microsoft.com/office/drawing/2016/5/11/chartex" xmlns:cx6="http://schemas.microsoft.com/office/drawing/2016/5/12/chartex" xmlns:cx7="http://schemas.microsoft.com/office/drawing/2016/5/13/chartex" xmlns:cx8="http://schemas.microsoft.com/office/drawing/2016/5/14/chartex" xmlns:mc="http://schemas.openxmlformats.org/markup-compatibility/2006" xmlns:aink="http://schemas.microsoft.com/office/drawing/2016/ink" xmlns:am3d="http://schemas.microsoft.com/office/drawing/2017/model3d" xmlns:o="urn:schemas-microsoft-com:office:office" xmlns:oel="http://schemas.microsoft.com/office/2019/extlst" xmlns:r="http://schemas.openxmlformats.org/officeDocument/2006/relationships" xmlns:m="http://schemas.openxmlformats.org/officeDocument/2006/math" xmlns:v="urn:schemas-microsoft-com:vml" xmlns:wp14="http://schemas.microsoft.com/office/word/2010/wordprocessingDrawing" xmlns:wp="http://schemas.openxmlformats.org/drawingml/2006/wordprocessingDrawing" xmlns:w10="urn:schemas-microsoft-com:office:word" xmlns:w="http://schemas.openxmlformats.org/wordprocessingml/2006/main" xmlns:w14="http://schemas.microsoft.com/office/word/2010/wordml" xmlns:w15="http://schemas.microsoft.com/office/word/2012/wordml" xmlns:w16cex="http://schemas.microsoft.com/office/word/2018/wordml/cex" xmlns:w16cid="http://schemas.microsoft.com/office/word/2016/wordml/cid" xmlns:w16="http://schemas.microsoft.com/office/word/2018/wordml" xmlns:w16sdtdh="http://schemas.microsoft.com/office/word/2020/wordml/sdtdatahash" xmlns:w16se="http://schemas.microsoft.com/office/word/2015/wordml/symex" xmlns:wpg="http://schemas.microsoft.com/office/word/2010/wordprocessingGroup" xmlns:wpi="http://schemas.microsoft.com/office/word/2010/wordprocessingInk" xmlns:wne="http://schemas.microsoft.com/office/word/2006/wordml" xmlns:wps="http://schemas.microsoft.com/office/word/2010/wordprocessingShape" mc:Ignorable="w14 w15 w16se w16cid w16 w16cex w16sdtdh wp14">
+  <w:abstractNum w:abstractNumId="0" w15:restartNumberingAfterBreak="0">
+    <w:nsid w:val="13997DA7"/>
+    <w:multiLevelType w:val="multilevel"/>
+    <w:tmpl w:val="732AA122"/>
     <w:lvl w:ilvl="0">
       <w:start w:val="1"/>
       <w:numFmt w:val="bullet"/>
@@ -1051,117 +937,10 @@
       </w:rPr>
     </w:lvl>
   </w:abstractNum>
-  <w:abstractNum w:abstractNumId="2">
-    <w:lvl w:ilvl="0">
-      <w:start w:val="1"/>
-      <w:numFmt w:val="bullet"/>
-      <w:lvlText w:val="●"/>
-      <w:lvlJc w:val="left"/>
-      <w:pPr>
-        <w:ind w:left="720" w:hanging="360"/>
-      </w:pPr>
-      <w:rPr>
-        <w:u w:val="none"/>
-      </w:rPr>
-    </w:lvl>
-    <w:lvl w:ilvl="1">
-      <w:start w:val="1"/>
-      <w:numFmt w:val="bullet"/>
-      <w:lvlText w:val="○"/>
-      <w:lvlJc w:val="left"/>
-      <w:pPr>
-        <w:ind w:left="1440" w:hanging="360"/>
-      </w:pPr>
-      <w:rPr>
-        <w:u w:val="none"/>
-      </w:rPr>
-    </w:lvl>
-    <w:lvl w:ilvl="2">
-      <w:start w:val="1"/>
-      <w:numFmt w:val="bullet"/>
-      <w:lvlText w:val="■"/>
-      <w:lvlJc w:val="left"/>
-      <w:pPr>
-        <w:ind w:left="2160" w:hanging="360"/>
-      </w:pPr>
-      <w:rPr>
-        <w:u w:val="none"/>
-      </w:rPr>
-    </w:lvl>
-    <w:lvl w:ilvl="3">
-      <w:start w:val="1"/>
-      <w:numFmt w:val="bullet"/>
-      <w:lvlText w:val="●"/>
-      <w:lvlJc w:val="left"/>
-      <w:pPr>
-        <w:ind w:left="2880" w:hanging="360"/>
-      </w:pPr>
-      <w:rPr>
-        <w:u w:val="none"/>
-      </w:rPr>
-    </w:lvl>
-    <w:lvl w:ilvl="4">
-      <w:start w:val="1"/>
-      <w:numFmt w:val="bullet"/>
-      <w:lvlText w:val="○"/>
-      <w:lvlJc w:val="left"/>
-      <w:pPr>
-        <w:ind w:left="3600" w:hanging="360"/>
-      </w:pPr>
-      <w:rPr>
-        <w:u w:val="none"/>
-      </w:rPr>
-    </w:lvl>
-    <w:lvl w:ilvl="5">
-      <w:start w:val="1"/>
-      <w:numFmt w:val="bullet"/>
-      <w:lvlText w:val="■"/>
-      <w:lvlJc w:val="left"/>
-      <w:pPr>
-        <w:ind w:left="4320" w:hanging="360"/>
-      </w:pPr>
-      <w:rPr>
-        <w:u w:val="none"/>
-      </w:rPr>
-    </w:lvl>
-    <w:lvl w:ilvl="6">
-      <w:start w:val="1"/>
-      <w:numFmt w:val="bullet"/>
-      <w:lvlText w:val="●"/>
-      <w:lvlJc w:val="left"/>
-      <w:pPr>
-        <w:ind w:left="5040" w:hanging="360"/>
-      </w:pPr>
-      <w:rPr>
-        <w:u w:val="none"/>
-      </w:rPr>
-    </w:lvl>
-    <w:lvl w:ilvl="7">
-      <w:start w:val="1"/>
-      <w:numFmt w:val="bullet"/>
-      <w:lvlText w:val="○"/>
-      <w:lvlJc w:val="left"/>
-      <w:pPr>
-        <w:ind w:left="5760" w:hanging="360"/>
-      </w:pPr>
-      <w:rPr>
-        <w:u w:val="none"/>
-      </w:rPr>
-    </w:lvl>
-    <w:lvl w:ilvl="8">
-      <w:start w:val="1"/>
-      <w:numFmt w:val="bullet"/>
-      <w:lvlText w:val="■"/>
-      <w:lvlJc w:val="left"/>
-      <w:pPr>
-        <w:ind w:left="6480" w:hanging="360"/>
-      </w:pPr>
-      <w:rPr>
-        <w:u w:val="none"/>
-      </w:rPr>
-    </w:lvl>
-  </w:abstractNum>
-  <w:abstractNum w:abstractNumId="3">
+  <w:abstractNum w:abstractNumId="1" w15:restartNumberingAfterBreak="0">
+    <w:nsid w:val="2E8279E5"/>
+    <w:multiLevelType w:val="multilevel"/>
+    <w:tmpl w:val="46D27E34"/>
     <w:lvl w:ilvl="0">
       <w:start w:val="1"/>
       <w:numFmt w:val="decimal"/>
@@ -1271,7 +1050,10 @@
       </w:rPr>
     </w:lvl>
   </w:abstractNum>
-  <w:abstractNum w:abstractNumId="4">
+  <w:abstractNum w:abstractNumId="2" w15:restartNumberingAfterBreak="0">
+    <w:nsid w:val="42B84446"/>
+    <w:multiLevelType w:val="multilevel"/>
+    <w:tmpl w:val="E50463F8"/>
     <w:lvl w:ilvl="0">
       <w:start w:val="1"/>
       <w:numFmt w:val="bullet"/>
@@ -1381,7 +1163,10 @@
       </w:rPr>
     </w:lvl>
   </w:abstractNum>
-  <w:abstractNum w:abstractNumId="5">
+  <w:abstractNum w:abstractNumId="3" w15:restartNumberingAfterBreak="0">
+    <w:nsid w:val="515F6CDF"/>
+    <w:multiLevelType w:val="multilevel"/>
+    <w:tmpl w:val="F950F92A"/>
     <w:lvl w:ilvl="0">
       <w:start w:val="1"/>
       <w:numFmt w:val="bullet"/>
@@ -1491,7 +1276,10 @@
       </w:rPr>
     </w:lvl>
   </w:abstractNum>
-  <w:abstractNum w:abstractNumId="6">
+  <w:abstractNum w:abstractNumId="4" w15:restartNumberingAfterBreak="0">
+    <w:nsid w:val="53F52303"/>
+    <w:multiLevelType w:val="multilevel"/>
+    <w:tmpl w:val="AA7CD7C4"/>
     <w:lvl w:ilvl="0">
       <w:start w:val="1"/>
       <w:numFmt w:val="bullet"/>
@@ -1601,7 +1389,10 @@
       </w:rPr>
     </w:lvl>
   </w:abstractNum>
-  <w:abstractNum w:abstractNumId="7">
+  <w:abstractNum w:abstractNumId="5" w15:restartNumberingAfterBreak="0">
+    <w:nsid w:val="5CB96C07"/>
+    <w:multiLevelType w:val="multilevel"/>
+    <w:tmpl w:val="07F2220E"/>
     <w:lvl w:ilvl="0">
       <w:start w:val="1"/>
       <w:numFmt w:val="bullet"/>
@@ -1711,39 +1502,152 @@
       </w:rPr>
     </w:lvl>
   </w:abstractNum>
-  <w:num w:numId="1">
+  <w:abstractNum w:abstractNumId="6" w15:restartNumberingAfterBreak="0">
+    <w:nsid w:val="5DF24A61"/>
+    <w:multiLevelType w:val="multilevel"/>
+    <w:tmpl w:val="50F2BE44"/>
+    <w:lvl w:ilvl="0">
+      <w:start w:val="1"/>
+      <w:numFmt w:val="bullet"/>
+      <w:lvlText w:val="●"/>
+      <w:lvlJc w:val="left"/>
+      <w:pPr>
+        <w:ind w:left="720" w:hanging="360"/>
+      </w:pPr>
+      <w:rPr>
+        <w:u w:val="none"/>
+      </w:rPr>
+    </w:lvl>
+    <w:lvl w:ilvl="1">
+      <w:start w:val="1"/>
+      <w:numFmt w:val="bullet"/>
+      <w:lvlText w:val="○"/>
+      <w:lvlJc w:val="left"/>
+      <w:pPr>
+        <w:ind w:left="1440" w:hanging="360"/>
+      </w:pPr>
+      <w:rPr>
+        <w:u w:val="none"/>
+      </w:rPr>
+    </w:lvl>
+    <w:lvl w:ilvl="2">
+      <w:start w:val="1"/>
+      <w:numFmt w:val="bullet"/>
+      <w:lvlText w:val="■"/>
+      <w:lvlJc w:val="left"/>
+      <w:pPr>
+        <w:ind w:left="2160" w:hanging="360"/>
+      </w:pPr>
+      <w:rPr>
+        <w:u w:val="none"/>
+      </w:rPr>
+    </w:lvl>
+    <w:lvl w:ilvl="3">
+      <w:start w:val="1"/>
+      <w:numFmt w:val="bullet"/>
+      <w:lvlText w:val="●"/>
+      <w:lvlJc w:val="left"/>
+      <w:pPr>
+        <w:ind w:left="2880" w:hanging="360"/>
+      </w:pPr>
+      <w:rPr>
+        <w:u w:val="none"/>
+      </w:rPr>
+    </w:lvl>
+    <w:lvl w:ilvl="4">
+      <w:start w:val="1"/>
+      <w:numFmt w:val="bullet"/>
+      <w:lvlText w:val="○"/>
+      <w:lvlJc w:val="left"/>
+      <w:pPr>
+        <w:ind w:left="3600" w:hanging="360"/>
+      </w:pPr>
+      <w:rPr>
+        <w:u w:val="none"/>
+      </w:rPr>
+    </w:lvl>
+    <w:lvl w:ilvl="5">
+      <w:start w:val="1"/>
+      <w:numFmt w:val="bullet"/>
+      <w:lvlText w:val="■"/>
+      <w:lvlJc w:val="left"/>
+      <w:pPr>
+        <w:ind w:left="4320" w:hanging="360"/>
+      </w:pPr>
+      <w:rPr>
+        <w:u w:val="none"/>
+      </w:rPr>
+    </w:lvl>
+    <w:lvl w:ilvl="6">
+      <w:start w:val="1"/>
+      <w:numFmt w:val="bullet"/>
+      <w:lvlText w:val="●"/>
+      <w:lvlJc w:val="left"/>
+      <w:pPr>
+        <w:ind w:left="5040" w:hanging="360"/>
+      </w:pPr>
+      <w:rPr>
+        <w:u w:val="none"/>
+      </w:rPr>
+    </w:lvl>
+    <w:lvl w:ilvl="7">
+      <w:start w:val="1"/>
+      <w:numFmt w:val="bullet"/>
+      <w:lvlText w:val="○"/>
+      <w:lvlJc w:val="left"/>
+      <w:pPr>
+        <w:ind w:left="5760" w:hanging="360"/>
+      </w:pPr>
+      <w:rPr>
+        <w:u w:val="none"/>
+      </w:rPr>
+    </w:lvl>
+    <w:lvl w:ilvl="8">
+      <w:start w:val="1"/>
+      <w:numFmt w:val="bullet"/>
+      <w:lvlText w:val="■"/>
+      <w:lvlJc w:val="left"/>
+      <w:pPr>
+        <w:ind w:left="6480" w:hanging="360"/>
+      </w:pPr>
+      <w:rPr>
+        <w:u w:val="none"/>
+      </w:rPr>
+    </w:lvl>
+  </w:abstractNum>
+  <w:num w:numId="1" w16cid:durableId="1699773162">
+    <w:abstractNumId w:val="2"/>
+  </w:num>
+  <w:num w:numId="2" w16cid:durableId="880751706">
+    <w:abstractNumId w:val="0"/>
+  </w:num>
+  <w:num w:numId="3" w16cid:durableId="627980643">
     <w:abstractNumId w:val="1"/>
   </w:num>
-  <w:num w:numId="2">
-    <w:abstractNumId w:val="2"/>
+  <w:num w:numId="4" w16cid:durableId="1986425584">
+    <w:abstractNumId w:val="4"/>
   </w:num>
-  <w:num w:numId="3">
+  <w:num w:numId="5" w16cid:durableId="998771963">
     <w:abstractNumId w:val="3"/>
   </w:num>
-  <w:num w:numId="4">
-    <w:abstractNumId w:val="4"/>
-  </w:num>
-  <w:num w:numId="5">
+  <w:num w:numId="6" w16cid:durableId="1325664443">
     <w:abstractNumId w:val="5"/>
   </w:num>
-  <w:num w:numId="6">
+  <w:num w:numId="7" w16cid:durableId="222372857">
     <w:abstractNumId w:val="6"/>
-  </w:num>
-  <w:num w:numId="7">
-    <w:abstractNumId w:val="7"/>
   </w:num>
 </w:numbering>
 </file>
 
 <file path=word/styles.xml><?xml version="1.0" encoding="utf-8"?>
-<w:styles xmlns:mc="http://schemas.openxmlformats.org/markup-compatibility/2006" xmlns:o="urn:schemas-microsoft-com:office:office" xmlns:r="http://schemas.openxmlformats.org/officeDocument/2006/relationships" xmlns:m="http://schemas.openxmlformats.org/officeDocument/2006/math" xmlns:v="urn:schemas-microsoft-com:vml" xmlns:wp="http://schemas.openxmlformats.org/drawingml/2006/wordprocessingDrawing" xmlns:w10="urn:schemas-microsoft-com:office:word" xmlns:w="http://schemas.openxmlformats.org/wordprocessingml/2006/main" xmlns:wne="http://schemas.microsoft.com/office/word/2006/wordml" xmlns:sl="http://schemas.openxmlformats.org/schemaLibrary/2006/main" xmlns:a="http://schemas.openxmlformats.org/drawingml/2006/main" xmlns:pic="http://schemas.openxmlformats.org/drawingml/2006/picture" xmlns:c="http://schemas.openxmlformats.org/drawingml/2006/chart" xmlns:lc="http://schemas.openxmlformats.org/drawingml/2006/lockedCanvas" xmlns:dgm="http://schemas.openxmlformats.org/drawingml/2006/diagram" xmlns:wps="http://schemas.microsoft.com/office/word/2010/wordprocessingShape" xmlns:wpg="http://schemas.microsoft.com/office/word/2010/wordprocessingGroup" xmlns:w14="http://schemas.microsoft.com/office/word/2010/wordml" xmlns:w15="http://schemas.microsoft.com/office/word/2012/wordml" xmlns:w16="http://schemas.microsoft.com/office/word/2018/wordml" xmlns:w16cex="http://schemas.microsoft.com/office/word/2018/wordml/cex" xmlns:w16cid="http://schemas.microsoft.com/office/word/2016/wordml/cid" xmlns="http://schemas.microsoft.com/office/tasks/2019/documenttasks" xmlns:cr="http://schemas.microsoft.com/office/comments/2020/reactions">
+<w:styles xmlns:mc="http://schemas.openxmlformats.org/markup-compatibility/2006" xmlns:r="http://schemas.openxmlformats.org/officeDocument/2006/relationships" xmlns:w="http://schemas.openxmlformats.org/wordprocessingml/2006/main" xmlns:w14="http://schemas.microsoft.com/office/word/2010/wordml" xmlns:w15="http://schemas.microsoft.com/office/word/2012/wordml" xmlns:w16cex="http://schemas.microsoft.com/office/word/2018/wordml/cex" xmlns:w16cid="http://schemas.microsoft.com/office/word/2016/wordml/cid" xmlns:w16="http://schemas.microsoft.com/office/word/2018/wordml" xmlns:w16sdtdh="http://schemas.microsoft.com/office/word/2020/wordml/sdtdatahash" xmlns:w16se="http://schemas.microsoft.com/office/word/2015/wordml/symex" mc:Ignorable="w14 w15 w16se w16cid w16 w16cex w16sdtdh">
   <w:docDefaults>
     <w:rPrDefault>
       <w:rPr>
-        <w:rFonts w:ascii="Arial" w:cs="Arial" w:eastAsia="Arial" w:hAnsi="Arial"/>
+        <w:rFonts w:ascii="Arial" w:eastAsia="Arial" w:hAnsi="Arial" w:cs="Arial"/>
         <w:sz w:val="22"/>
         <w:szCs w:val="22"/>
-        <w:lang w:val="en"/>
+        <w:lang w:val="en" w:eastAsia="en-US" w:bidi="ar-SA"/>
       </w:rPr>
     </w:rPrDefault>
     <w:pPrDefault>
@@ -1752,29 +1656,399 @@
       </w:pPr>
     </w:pPrDefault>
   </w:docDefaults>
-  <w:style w:type="table" w:styleId="TableNormal" w:default="1">
-    <w:name w:val="TableNormal"/>
-    <w:tblPr>
-      <w:tblCellMar>
-        <w:top w:w="100.0" w:type="dxa"/>
-        <w:left w:w="100.0" w:type="dxa"/>
-        <w:bottom w:w="100.0" w:type="dxa"/>
-        <w:right w:w="100.0" w:type="dxa"/>
-      </w:tblCellMar>
-    </w:tblPr>
-  </w:style>
-  <w:style w:type="paragraph" w:styleId="Normal" w:default="1">
-    <w:name w:val="normal"/>
+  <w:latentStyles w:defLockedState="0" w:defUIPriority="99" w:defSemiHidden="0" w:defUnhideWhenUsed="0" w:defQFormat="0" w:count="376">
+    <w:lsdException w:name="Normal" w:uiPriority="0" w:qFormat="1"/>
+    <w:lsdException w:name="heading 1" w:uiPriority="9" w:qFormat="1"/>
+    <w:lsdException w:name="heading 2" w:semiHidden="1" w:uiPriority="9" w:unhideWhenUsed="1" w:qFormat="1"/>
+    <w:lsdException w:name="heading 3" w:semiHidden="1" w:uiPriority="9" w:unhideWhenUsed="1" w:qFormat="1"/>
+    <w:lsdException w:name="heading 4" w:semiHidden="1" w:uiPriority="9" w:unhideWhenUsed="1" w:qFormat="1"/>
+    <w:lsdException w:name="heading 5" w:semiHidden="1" w:uiPriority="9" w:unhideWhenUsed="1" w:qFormat="1"/>
+    <w:lsdException w:name="heading 6" w:semiHidden="1" w:uiPriority="9" w:unhideWhenUsed="1" w:qFormat="1"/>
+    <w:lsdException w:name="heading 7" w:semiHidden="1" w:uiPriority="9" w:unhideWhenUsed="1" w:qFormat="1"/>
+    <w:lsdException w:name="heading 8" w:semiHidden="1" w:uiPriority="9" w:unhideWhenUsed="1" w:qFormat="1"/>
+    <w:lsdException w:name="heading 9" w:semiHidden="1" w:uiPriority="9" w:unhideWhenUsed="1" w:qFormat="1"/>
+    <w:lsdException w:name="index 1" w:semiHidden="1" w:unhideWhenUsed="1"/>
+    <w:lsdException w:name="index 2" w:semiHidden="1" w:unhideWhenUsed="1"/>
+    <w:lsdException w:name="index 3" w:semiHidden="1" w:unhideWhenUsed="1"/>
+    <w:lsdException w:name="index 4" w:semiHidden="1" w:unhideWhenUsed="1"/>
+    <w:lsdException w:name="index 5" w:semiHidden="1" w:unhideWhenUsed="1"/>
+    <w:lsdException w:name="index 6" w:semiHidden="1" w:unhideWhenUsed="1"/>
+    <w:lsdException w:name="index 7" w:semiHidden="1" w:unhideWhenUsed="1"/>
+    <w:lsdException w:name="index 8" w:semiHidden="1" w:unhideWhenUsed="1"/>
+    <w:lsdException w:name="index 9" w:semiHidden="1" w:unhideWhenUsed="1"/>
+    <w:lsdException w:name="toc 1" w:semiHidden="1" w:uiPriority="39" w:unhideWhenUsed="1"/>
+    <w:lsdException w:name="toc 2" w:semiHidden="1" w:uiPriority="39" w:unhideWhenUsed="1"/>
+    <w:lsdException w:name="toc 3" w:semiHidden="1" w:uiPriority="39" w:unhideWhenUsed="1"/>
+    <w:lsdException w:name="toc 4" w:semiHidden="1" w:uiPriority="39" w:unhideWhenUsed="1"/>
+    <w:lsdException w:name="toc 5" w:semiHidden="1" w:uiPriority="39" w:unhideWhenUsed="1"/>
+    <w:lsdException w:name="toc 6" w:semiHidden="1" w:uiPriority="39" w:unhideWhenUsed="1"/>
+    <w:lsdException w:name="toc 7" w:semiHidden="1" w:uiPriority="39" w:unhideWhenUsed="1"/>
+    <w:lsdException w:name="toc 8" w:semiHidden="1" w:uiPriority="39" w:unhideWhenUsed="1"/>
+    <w:lsdException w:name="toc 9" w:semiHidden="1" w:uiPriority="39" w:unhideWhenUsed="1"/>
+    <w:lsdException w:name="Normal Indent" w:semiHidden="1" w:unhideWhenUsed="1"/>
+    <w:lsdException w:name="footnote text" w:semiHidden="1" w:unhideWhenUsed="1"/>
+    <w:lsdException w:name="annotation text" w:semiHidden="1" w:unhideWhenUsed="1"/>
+    <w:lsdException w:name="header" w:semiHidden="1" w:unhideWhenUsed="1"/>
+    <w:lsdException w:name="footer" w:semiHidden="1" w:unhideWhenUsed="1"/>
+    <w:lsdException w:name="index heading" w:semiHidden="1" w:unhideWhenUsed="1"/>
+    <w:lsdException w:name="caption" w:semiHidden="1" w:uiPriority="35" w:unhideWhenUsed="1" w:qFormat="1"/>
+    <w:lsdException w:name="table of figures" w:semiHidden="1" w:unhideWhenUsed="1"/>
+    <w:lsdException w:name="envelope address" w:semiHidden="1" w:unhideWhenUsed="1"/>
+    <w:lsdException w:name="envelope return" w:semiHidden="1" w:unhideWhenUsed="1"/>
+    <w:lsdException w:name="footnote reference" w:semiHidden="1" w:unhideWhenUsed="1"/>
+    <w:lsdException w:name="annotation reference" w:semiHidden="1" w:unhideWhenUsed="1"/>
+    <w:lsdException w:name="line number" w:semiHidden="1" w:unhideWhenUsed="1"/>
+    <w:lsdException w:name="page number" w:semiHidden="1" w:unhideWhenUsed="1"/>
+    <w:lsdException w:name="endnote reference" w:semiHidden="1" w:unhideWhenUsed="1"/>
+    <w:lsdException w:name="endnote text" w:semiHidden="1" w:unhideWhenUsed="1"/>
+    <w:lsdException w:name="table of authorities" w:semiHidden="1" w:unhideWhenUsed="1"/>
+    <w:lsdException w:name="macro" w:semiHidden="1" w:unhideWhenUsed="1"/>
+    <w:lsdException w:name="toa heading" w:semiHidden="1" w:unhideWhenUsed="1"/>
+    <w:lsdException w:name="List" w:semiHidden="1" w:unhideWhenUsed="1"/>
+    <w:lsdException w:name="List Bullet" w:semiHidden="1" w:unhideWhenUsed="1"/>
+    <w:lsdException w:name="List Number" w:semiHidden="1" w:unhideWhenUsed="1"/>
+    <w:lsdException w:name="List 2" w:semiHidden="1" w:unhideWhenUsed="1"/>
+    <w:lsdException w:name="List 3" w:semiHidden="1" w:unhideWhenUsed="1"/>
+    <w:lsdException w:name="List 4" w:semiHidden="1" w:unhideWhenUsed="1"/>
+    <w:lsdException w:name="List 5" w:semiHidden="1" w:unhideWhenUsed="1"/>
+    <w:lsdException w:name="List Bullet 2" w:semiHidden="1" w:unhideWhenUsed="1"/>
+    <w:lsdException w:name="List Bullet 3" w:semiHidden="1" w:unhideWhenUsed="1"/>
+    <w:lsdException w:name="List Bullet 4" w:semiHidden="1" w:unhideWhenUsed="1"/>
+    <w:lsdException w:name="List Bullet 5" w:semiHidden="1" w:unhideWhenUsed="1"/>
+    <w:lsdException w:name="List Number 2" w:semiHidden="1" w:unhideWhenUsed="1"/>
+    <w:lsdException w:name="List Number 3" w:semiHidden="1" w:unhideWhenUsed="1"/>
+    <w:lsdException w:name="List Number 4" w:semiHidden="1" w:unhideWhenUsed="1"/>
+    <w:lsdException w:name="List Number 5" w:semiHidden="1" w:unhideWhenUsed="1"/>
+    <w:lsdException w:name="Title" w:uiPriority="10" w:qFormat="1"/>
+    <w:lsdException w:name="Closing" w:semiHidden="1" w:unhideWhenUsed="1"/>
+    <w:lsdException w:name="Signature" w:semiHidden="1" w:unhideWhenUsed="1"/>
+    <w:lsdException w:name="Default Paragraph Font" w:semiHidden="1" w:uiPriority="1" w:unhideWhenUsed="1"/>
+    <w:lsdException w:name="Body Text" w:semiHidden="1" w:unhideWhenUsed="1"/>
+    <w:lsdException w:name="Body Text Indent" w:semiHidden="1" w:unhideWhenUsed="1"/>
+    <w:lsdException w:name="List Continue" w:semiHidden="1" w:unhideWhenUsed="1"/>
+    <w:lsdException w:name="List Continue 2" w:semiHidden="1" w:unhideWhenUsed="1"/>
+    <w:lsdException w:name="List Continue 3" w:semiHidden="1" w:unhideWhenUsed="1"/>
+    <w:lsdException w:name="List Continue 4" w:semiHidden="1" w:unhideWhenUsed="1"/>
+    <w:lsdException w:name="List Continue 5" w:semiHidden="1" w:unhideWhenUsed="1"/>
+    <w:lsdException w:name="Message Header" w:semiHidden="1" w:unhideWhenUsed="1"/>
+    <w:lsdException w:name="Subtitle" w:uiPriority="11" w:qFormat="1"/>
+    <w:lsdException w:name="Salutation" w:semiHidden="1" w:unhideWhenUsed="1"/>
+    <w:lsdException w:name="Date" w:semiHidden="1" w:unhideWhenUsed="1"/>
+    <w:lsdException w:name="Body Text First Indent" w:semiHidden="1" w:unhideWhenUsed="1"/>
+    <w:lsdException w:name="Body Text First Indent 2" w:semiHidden="1" w:unhideWhenUsed="1"/>
+    <w:lsdException w:name="Note Heading" w:semiHidden="1" w:unhideWhenUsed="1"/>
+    <w:lsdException w:name="Body Text 2" w:semiHidden="1" w:unhideWhenUsed="1"/>
+    <w:lsdException w:name="Body Text 3" w:semiHidden="1" w:unhideWhenUsed="1"/>
+    <w:lsdException w:name="Body Text Indent 2" w:semiHidden="1" w:unhideWhenUsed="1"/>
+    <w:lsdException w:name="Body Text Indent 3" w:semiHidden="1" w:unhideWhenUsed="1"/>
+    <w:lsdException w:name="Block Text" w:semiHidden="1" w:unhideWhenUsed="1"/>
+    <w:lsdException w:name="Hyperlink" w:semiHidden="1" w:unhideWhenUsed="1"/>
+    <w:lsdException w:name="FollowedHyperlink" w:semiHidden="1" w:unhideWhenUsed="1"/>
+    <w:lsdException w:name="Strong" w:uiPriority="22" w:qFormat="1"/>
+    <w:lsdException w:name="Emphasis" w:uiPriority="20" w:qFormat="1"/>
+    <w:lsdException w:name="Document Map" w:semiHidden="1" w:unhideWhenUsed="1"/>
+    <w:lsdException w:name="Plain Text" w:semiHidden="1" w:unhideWhenUsed="1"/>
+    <w:lsdException w:name="E-mail Signature" w:semiHidden="1" w:unhideWhenUsed="1"/>
+    <w:lsdException w:name="HTML Top of Form" w:semiHidden="1" w:unhideWhenUsed="1"/>
+    <w:lsdException w:name="HTML Bottom of Form" w:semiHidden="1" w:unhideWhenUsed="1"/>
+    <w:lsdException w:name="Normal (Web)" w:semiHidden="1" w:unhideWhenUsed="1"/>
+    <w:lsdException w:name="HTML Acronym" w:semiHidden="1" w:unhideWhenUsed="1"/>
+    <w:lsdException w:name="HTML Address" w:semiHidden="1" w:unhideWhenUsed="1"/>
+    <w:lsdException w:name="HTML Cite" w:semiHidden="1" w:unhideWhenUsed="1"/>
+    <w:lsdException w:name="HTML Code" w:semiHidden="1" w:unhideWhenUsed="1"/>
+    <w:lsdException w:name="HTML Definition" w:semiHidden="1" w:unhideWhenUsed="1"/>
+    <w:lsdException w:name="HTML Keyboard" w:semiHidden="1" w:unhideWhenUsed="1"/>
+    <w:lsdException w:name="HTML Preformatted" w:semiHidden="1" w:unhideWhenUsed="1"/>
+    <w:lsdException w:name="HTML Sample" w:semiHidden="1" w:unhideWhenUsed="1"/>
+    <w:lsdException w:name="HTML Typewriter" w:semiHidden="1" w:unhideWhenUsed="1"/>
+    <w:lsdException w:name="HTML Variable" w:semiHidden="1" w:unhideWhenUsed="1"/>
+    <w:lsdException w:name="Normal Table" w:semiHidden="1" w:unhideWhenUsed="1"/>
+    <w:lsdException w:name="annotation subject" w:semiHidden="1" w:unhideWhenUsed="1"/>
+    <w:lsdException w:name="No List" w:semiHidden="1" w:unhideWhenUsed="1"/>
+    <w:lsdException w:name="Outline List 1" w:semiHidden="1" w:unhideWhenUsed="1"/>
+    <w:lsdException w:name="Outline List 2" w:semiHidden="1" w:unhideWhenUsed="1"/>
+    <w:lsdException w:name="Outline List 3" w:semiHidden="1" w:unhideWhenUsed="1"/>
+    <w:lsdException w:name="Table Simple 1" w:semiHidden="1" w:unhideWhenUsed="1"/>
+    <w:lsdException w:name="Table Simple 2" w:semiHidden="1" w:unhideWhenUsed="1"/>
+    <w:lsdException w:name="Table Simple 3" w:semiHidden="1" w:unhideWhenUsed="1"/>
+    <w:lsdException w:name="Table Classic 1" w:semiHidden="1" w:unhideWhenUsed="1"/>
+    <w:lsdException w:name="Table Classic 2" w:semiHidden="1" w:unhideWhenUsed="1"/>
+    <w:lsdException w:name="Table Classic 3" w:semiHidden="1" w:unhideWhenUsed="1"/>
+    <w:lsdException w:name="Table Classic 4" w:semiHidden="1" w:unhideWhenUsed="1"/>
+    <w:lsdException w:name="Table Colorful 1" w:semiHidden="1" w:unhideWhenUsed="1"/>
+    <w:lsdException w:name="Table Colorful 2" w:semiHidden="1" w:unhideWhenUsed="1"/>
+    <w:lsdException w:name="Table Colorful 3" w:semiHidden="1" w:unhideWhenUsed="1"/>
+    <w:lsdException w:name="Table Columns 1" w:semiHidden="1" w:unhideWhenUsed="1"/>
+    <w:lsdException w:name="Table Columns 2" w:semiHidden="1" w:unhideWhenUsed="1"/>
+    <w:lsdException w:name="Table Columns 3" w:semiHidden="1" w:unhideWhenUsed="1"/>
+    <w:lsdException w:name="Table Columns 4" w:semiHidden="1" w:unhideWhenUsed="1"/>
+    <w:lsdException w:name="Table Columns 5" w:semiHidden="1" w:unhideWhenUsed="1"/>
+    <w:lsdException w:name="Table Grid 1" w:semiHidden="1" w:unhideWhenUsed="1"/>
+    <w:lsdException w:name="Table Grid 2" w:semiHidden="1" w:unhideWhenUsed="1"/>
+    <w:lsdException w:name="Table Grid 3" w:semiHidden="1" w:unhideWhenUsed="1"/>
+    <w:lsdException w:name="Table Grid 4" w:semiHidden="1" w:unhideWhenUsed="1"/>
+    <w:lsdException w:name="Table Grid 5" w:semiHidden="1" w:unhideWhenUsed="1"/>
+    <w:lsdException w:name="Table Grid 6" w:semiHidden="1" w:unhideWhenUsed="1"/>
+    <w:lsdException w:name="Table Grid 7" w:semiHidden="1" w:unhideWhenUsed="1"/>
+    <w:lsdException w:name="Table Grid 8" w:semiHidden="1" w:unhideWhenUsed="1"/>
+    <w:lsdException w:name="Table List 1" w:semiHidden="1" w:unhideWhenUsed="1"/>
+    <w:lsdException w:name="Table List 2" w:semiHidden="1" w:unhideWhenUsed="1"/>
+    <w:lsdException w:name="Table List 3" w:semiHidden="1" w:unhideWhenUsed="1"/>
+    <w:lsdException w:name="Table List 4" w:semiHidden="1" w:unhideWhenUsed="1"/>
+    <w:lsdException w:name="Table List 5" w:semiHidden="1" w:unhideWhenUsed="1"/>
+    <w:lsdException w:name="Table List 6" w:semiHidden="1" w:unhideWhenUsed="1"/>
+    <w:lsdException w:name="Table List 7" w:semiHidden="1" w:unhideWhenUsed="1"/>
+    <w:lsdException w:name="Table List 8" w:semiHidden="1" w:unhideWhenUsed="1"/>
+    <w:lsdException w:name="Table 3D effects 1" w:semiHidden="1" w:unhideWhenUsed="1"/>
+    <w:lsdException w:name="Table 3D effects 2" w:semiHidden="1" w:unhideWhenUsed="1"/>
+    <w:lsdException w:name="Table 3D effects 3" w:semiHidden="1" w:unhideWhenUsed="1"/>
+    <w:lsdException w:name="Table Contemporary" w:semiHidden="1" w:unhideWhenUsed="1"/>
+    <w:lsdException w:name="Table Elegant" w:semiHidden="1" w:unhideWhenUsed="1"/>
+    <w:lsdException w:name="Table Professional" w:semiHidden="1" w:unhideWhenUsed="1"/>
+    <w:lsdException w:name="Table Subtle 1" w:semiHidden="1" w:unhideWhenUsed="1"/>
+    <w:lsdException w:name="Table Subtle 2" w:semiHidden="1" w:unhideWhenUsed="1"/>
+    <w:lsdException w:name="Table Web 1" w:semiHidden="1" w:unhideWhenUsed="1"/>
+    <w:lsdException w:name="Table Web 2" w:semiHidden="1" w:unhideWhenUsed="1"/>
+    <w:lsdException w:name="Table Web 3" w:semiHidden="1" w:unhideWhenUsed="1"/>
+    <w:lsdException w:name="Balloon Text" w:semiHidden="1" w:unhideWhenUsed="1"/>
+    <w:lsdException w:name="Table Grid" w:uiPriority="39"/>
+    <w:lsdException w:name="Table Theme" w:semiHidden="1" w:unhideWhenUsed="1"/>
+    <w:lsdException w:name="Placeholder Text" w:semiHidden="1"/>
+    <w:lsdException w:name="No Spacing" w:uiPriority="1" w:qFormat="1"/>
+    <w:lsdException w:name="Light Shading" w:uiPriority="60"/>
+    <w:lsdException w:name="Light List" w:uiPriority="61"/>
+    <w:lsdException w:name="Light Grid" w:uiPriority="62"/>
+    <w:lsdException w:name="Medium Shading 1" w:uiPriority="63"/>
+    <w:lsdException w:name="Medium Shading 2" w:uiPriority="64"/>
+    <w:lsdException w:name="Medium List 1" w:uiPriority="65"/>
+    <w:lsdException w:name="Medium List 2" w:uiPriority="66"/>
+    <w:lsdException w:name="Medium Grid 1" w:uiPriority="67"/>
+    <w:lsdException w:name="Medium Grid 2" w:uiPriority="68"/>
+    <w:lsdException w:name="Medium Grid 3" w:uiPriority="69"/>
+    <w:lsdException w:name="Dark List" w:uiPriority="70"/>
+    <w:lsdException w:name="Colorful Shading" w:uiPriority="71"/>
+    <w:lsdException w:name="Colorful List" w:uiPriority="72"/>
+    <w:lsdException w:name="Colorful Grid" w:uiPriority="73"/>
+    <w:lsdException w:name="Light Shading Accent 1" w:uiPriority="60"/>
+    <w:lsdException w:name="Light List Accent 1" w:uiPriority="61"/>
+    <w:lsdException w:name="Light Grid Accent 1" w:uiPriority="62"/>
+    <w:lsdException w:name="Medium Shading 1 Accent 1" w:uiPriority="63"/>
+    <w:lsdException w:name="Medium Shading 2 Accent 1" w:uiPriority="64"/>
+    <w:lsdException w:name="Medium List 1 Accent 1" w:uiPriority="65"/>
+    <w:lsdException w:name="Revision" w:semiHidden="1"/>
+    <w:lsdException w:name="List Paragraph" w:uiPriority="34" w:qFormat="1"/>
+    <w:lsdException w:name="Quote" w:uiPriority="29" w:qFormat="1"/>
+    <w:lsdException w:name="Intense Quote" w:uiPriority="30" w:qFormat="1"/>
+    <w:lsdException w:name="Medium List 2 Accent 1" w:uiPriority="66"/>
+    <w:lsdException w:name="Medium Grid 1 Accent 1" w:uiPriority="67"/>
+    <w:lsdException w:name="Medium Grid 2 Accent 1" w:uiPriority="68"/>
+    <w:lsdException w:name="Medium Grid 3 Accent 1" w:uiPriority="69"/>
+    <w:lsdException w:name="Dark List Accent 1" w:uiPriority="70"/>
+    <w:lsdException w:name="Colorful Shading Accent 1" w:uiPriority="71"/>
+    <w:lsdException w:name="Colorful List Accent 1" w:uiPriority="72"/>
+    <w:lsdException w:name="Colorful Grid Accent 1" w:uiPriority="73"/>
+    <w:lsdException w:name="Light Shading Accent 2" w:uiPriority="60"/>
+    <w:lsdException w:name="Light List Accent 2" w:uiPriority="61"/>
+    <w:lsdException w:name="Light Grid Accent 2" w:uiPriority="62"/>
+    <w:lsdException w:name="Medium Shading 1 Accent 2" w:uiPriority="63"/>
+    <w:lsdException w:name="Medium Shading 2 Accent 2" w:uiPriority="64"/>
+    <w:lsdException w:name="Medium List 1 Accent 2" w:uiPriority="65"/>
+    <w:lsdException w:name="Medium List 2 Accent 2" w:uiPriority="66"/>
+    <w:lsdException w:name="Medium Grid 1 Accent 2" w:uiPriority="67"/>
+    <w:lsdException w:name="Medium Grid 2 Accent 2" w:uiPriority="68"/>
+    <w:lsdException w:name="Medium Grid 3 Accent 2" w:uiPriority="69"/>
+    <w:lsdException w:name="Dark List Accent 2" w:uiPriority="70"/>
+    <w:lsdException w:name="Colorful Shading Accent 2" w:uiPriority="71"/>
+    <w:lsdException w:name="Colorful List Accent 2" w:uiPriority="72"/>
+    <w:lsdException w:name="Colorful Grid Accent 2" w:uiPriority="73"/>
+    <w:lsdException w:name="Light Shading Accent 3" w:uiPriority="60"/>
+    <w:lsdException w:name="Light List Accent 3" w:uiPriority="61"/>
+    <w:lsdException w:name="Light Grid Accent 3" w:uiPriority="62"/>
+    <w:lsdException w:name="Medium Shading 1 Accent 3" w:uiPriority="63"/>
+    <w:lsdException w:name="Medium Shading 2 Accent 3" w:uiPriority="64"/>
+    <w:lsdException w:name="Medium List 1 Accent 3" w:uiPriority="65"/>
+    <w:lsdException w:name="Medium List 2 Accent 3" w:uiPriority="66"/>
+    <w:lsdException w:name="Medium Grid 1 Accent 3" w:uiPriority="67"/>
+    <w:lsdException w:name="Medium Grid 2 Accent 3" w:uiPriority="68"/>
+    <w:lsdException w:name="Medium Grid 3 Accent 3" w:uiPriority="69"/>
+    <w:lsdException w:name="Dark List Accent 3" w:uiPriority="70"/>
+    <w:lsdException w:name="Colorful Shading Accent 3" w:uiPriority="71"/>
+    <w:lsdException w:name="Colorful List Accent 3" w:uiPriority="72"/>
+    <w:lsdException w:name="Colorful Grid Accent 3" w:uiPriority="73"/>
+    <w:lsdException w:name="Light Shading Accent 4" w:uiPriority="60"/>
+    <w:lsdException w:name="Light List Accent 4" w:uiPriority="61"/>
+    <w:lsdException w:name="Light Grid Accent 4" w:uiPriority="62"/>
+    <w:lsdException w:name="Medium Shading 1 Accent 4" w:uiPriority="63"/>
+    <w:lsdException w:name="Medium Shading 2 Accent 4" w:uiPriority="64"/>
+    <w:lsdException w:name="Medium List 1 Accent 4" w:uiPriority="65"/>
+    <w:lsdException w:name="Medium List 2 Accent 4" w:uiPriority="66"/>
+    <w:lsdException w:name="Medium Grid 1 Accent 4" w:uiPriority="67"/>
+    <w:lsdException w:name="Medium Grid 2 Accent 4" w:uiPriority="68"/>
+    <w:lsdException w:name="Medium Grid 3 Accent 4" w:uiPriority="69"/>
+    <w:lsdException w:name="Dark List Accent 4" w:uiPriority="70"/>
+    <w:lsdException w:name="Colorful Shading Accent 4" w:uiPriority="71"/>
+    <w:lsdException w:name="Colorful List Accent 4" w:uiPriority="72"/>
+    <w:lsdException w:name="Colorful Grid Accent 4" w:uiPriority="73"/>
+    <w:lsdException w:name="Light Shading Accent 5" w:uiPriority="60"/>
+    <w:lsdException w:name="Light List Accent 5" w:uiPriority="61"/>
+    <w:lsdException w:name="Light Grid Accent 5" w:uiPriority="62"/>
+    <w:lsdException w:name="Medium Shading 1 Accent 5" w:uiPriority="63"/>
+    <w:lsdException w:name="Medium Shading 2 Accent 5" w:uiPriority="64"/>
+    <w:lsdException w:name="Medium List 1 Accent 5" w:uiPriority="65"/>
+    <w:lsdException w:name="Medium List 2 Accent 5" w:uiPriority="66"/>
+    <w:lsdException w:name="Medium Grid 1 Accent 5" w:uiPriority="67"/>
+    <w:lsdException w:name="Medium Grid 2 Accent 5" w:uiPriority="68"/>
+    <w:lsdException w:name="Medium Grid 3 Accent 5" w:uiPriority="69"/>
+    <w:lsdException w:name="Dark List Accent 5" w:uiPriority="70"/>
+    <w:lsdException w:name="Colorful Shading Accent 5" w:uiPriority="71"/>
+    <w:lsdException w:name="Colorful List Accent 5" w:uiPriority="72"/>
+    <w:lsdException w:name="Colorful Grid Accent 5" w:uiPriority="73"/>
+    <w:lsdException w:name="Light Shading Accent 6" w:uiPriority="60"/>
+    <w:lsdException w:name="Light List Accent 6" w:uiPriority="61"/>
+    <w:lsdException w:name="Light Grid Accent 6" w:uiPriority="62"/>
+    <w:lsdException w:name="Medium Shading 1 Accent 6" w:uiPriority="63"/>
+    <w:lsdException w:name="Medium Shading 2 Accent 6" w:uiPriority="64"/>
+    <w:lsdException w:name="Medium List 1 Accent 6" w:uiPriority="65"/>
+    <w:lsdException w:name="Medium List 2 Accent 6" w:uiPriority="66"/>
+    <w:lsdException w:name="Medium Grid 1 Accent 6" w:uiPriority="67"/>
+    <w:lsdException w:name="Medium Grid 2 Accent 6" w:uiPriority="68"/>
+    <w:lsdException w:name="Medium Grid 3 Accent 6" w:uiPriority="69"/>
+    <w:lsdException w:name="Dark List Accent 6" w:uiPriority="70"/>
+    <w:lsdException w:name="Colorful Shading Accent 6" w:uiPriority="71"/>
+    <w:lsdException w:name="Colorful List Accent 6" w:uiPriority="72"/>
+    <w:lsdException w:name="Colorful Grid Accent 6" w:uiPriority="73"/>
+    <w:lsdException w:name="Subtle Emphasis" w:uiPriority="19" w:qFormat="1"/>
+    <w:lsdException w:name="Intense Emphasis" w:uiPriority="21" w:qFormat="1"/>
+    <w:lsdException w:name="Subtle Reference" w:uiPriority="31" w:qFormat="1"/>
+    <w:lsdException w:name="Intense Reference" w:uiPriority="32" w:qFormat="1"/>
+    <w:lsdException w:name="Book Title" w:uiPriority="33" w:qFormat="1"/>
+    <w:lsdException w:name="Bibliography" w:semiHidden="1" w:uiPriority="37" w:unhideWhenUsed="1"/>
+    <w:lsdException w:name="TOC Heading" w:semiHidden="1" w:uiPriority="39" w:unhideWhenUsed="1" w:qFormat="1"/>
+    <w:lsdException w:name="Plain Table 1" w:uiPriority="41"/>
+    <w:lsdException w:name="Plain Table 2" w:uiPriority="42"/>
+    <w:lsdException w:name="Plain Table 3" w:uiPriority="43"/>
+    <w:lsdException w:name="Plain Table 4" w:uiPriority="44"/>
+    <w:lsdException w:name="Plain Table 5" w:uiPriority="45"/>
+    <w:lsdException w:name="Grid Table Light" w:uiPriority="40"/>
+    <w:lsdException w:name="Grid Table 1 Light" w:uiPriority="46"/>
+    <w:lsdException w:name="Grid Table 2" w:uiPriority="47"/>
+    <w:lsdException w:name="Grid Table 3" w:uiPriority="48"/>
+    <w:lsdException w:name="Grid Table 4" w:uiPriority="49"/>
+    <w:lsdException w:name="Grid Table 5 Dark" w:uiPriority="50"/>
+    <w:lsdException w:name="Grid Table 6 Colorful" w:uiPriority="51"/>
+    <w:lsdException w:name="Grid Table 7 Colorful" w:uiPriority="52"/>
+    <w:lsdException w:name="Grid Table 1 Light Accent 1" w:uiPriority="46"/>
+    <w:lsdException w:name="Grid Table 2 Accent 1" w:uiPriority="47"/>
+    <w:lsdException w:name="Grid Table 3 Accent 1" w:uiPriority="48"/>
+    <w:lsdException w:name="Grid Table 4 Accent 1" w:uiPriority="49"/>
+    <w:lsdException w:name="Grid Table 5 Dark Accent 1" w:uiPriority="50"/>
+    <w:lsdException w:name="Grid Table 6 Colorful Accent 1" w:uiPriority="51"/>
+    <w:lsdException w:name="Grid Table 7 Colorful Accent 1" w:uiPriority="52"/>
+    <w:lsdException w:name="Grid Table 1 Light Accent 2" w:uiPriority="46"/>
+    <w:lsdException w:name="Grid Table 2 Accent 2" w:uiPriority="47"/>
+    <w:lsdException w:name="Grid Table 3 Accent 2" w:uiPriority="48"/>
+    <w:lsdException w:name="Grid Table 4 Accent 2" w:uiPriority="49"/>
+    <w:lsdException w:name="Grid Table 5 Dark Accent 2" w:uiPriority="50"/>
+    <w:lsdException w:name="Grid Table 6 Colorful Accent 2" w:uiPriority="51"/>
+    <w:lsdException w:name="Grid Table 7 Colorful Accent 2" w:uiPriority="52"/>
+    <w:lsdException w:name="Grid Table 1 Light Accent 3" w:uiPriority="46"/>
+    <w:lsdException w:name="Grid Table 2 Accent 3" w:uiPriority="47"/>
+    <w:lsdException w:name="Grid Table 3 Accent 3" w:uiPriority="48"/>
+    <w:lsdException w:name="Grid Table 4 Accent 3" w:uiPriority="49"/>
+    <w:lsdException w:name="Grid Table 5 Dark Accent 3" w:uiPriority="50"/>
+    <w:lsdException w:name="Grid Table 6 Colorful Accent 3" w:uiPriority="51"/>
+    <w:lsdException w:name="Grid Table 7 Colorful Accent 3" w:uiPriority="52"/>
+    <w:lsdException w:name="Grid Table 1 Light Accent 4" w:uiPriority="46"/>
+    <w:lsdException w:name="Grid Table 2 Accent 4" w:uiPriority="47"/>
+    <w:lsdException w:name="Grid Table 3 Accent 4" w:uiPriority="48"/>
+    <w:lsdException w:name="Grid Table 4 Accent 4" w:uiPriority="49"/>
+    <w:lsdException w:name="Grid Table 5 Dark Accent 4" w:uiPriority="50"/>
+    <w:lsdException w:name="Grid Table 6 Colorful Accent 4" w:uiPriority="51"/>
+    <w:lsdException w:name="Grid Table 7 Colorful Accent 4" w:uiPriority="52"/>
+    <w:lsdException w:name="Grid Table 1 Light Accent 5" w:uiPriority="46"/>
+    <w:lsdException w:name="Grid Table 2 Accent 5" w:uiPriority="47"/>
+    <w:lsdException w:name="Grid Table 3 Accent 5" w:uiPriority="48"/>
+    <w:lsdException w:name="Grid Table 4 Accent 5" w:uiPriority="49"/>
+    <w:lsdException w:name="Grid Table 5 Dark Accent 5" w:uiPriority="50"/>
+    <w:lsdException w:name="Grid Table 6 Colorful Accent 5" w:uiPriority="51"/>
+    <w:lsdException w:name="Grid Table 7 Colorful Accent 5" w:uiPriority="52"/>
+    <w:lsdException w:name="Grid Table 1 Light Accent 6" w:uiPriority="46"/>
+    <w:lsdException w:name="Grid Table 2 Accent 6" w:uiPriority="47"/>
+    <w:lsdException w:name="Grid Table 3 Accent 6" w:uiPriority="48"/>
+    <w:lsdException w:name="Grid Table 4 Accent 6" w:uiPriority="49"/>
+    <w:lsdException w:name="Grid Table 5 Dark Accent 6" w:uiPriority="50"/>
+    <w:lsdException w:name="Grid Table 6 Colorful Accent 6" w:uiPriority="51"/>
+    <w:lsdException w:name="Grid Table 7 Colorful Accent 6" w:uiPriority="52"/>
+    <w:lsdException w:name="List Table 1 Light" w:uiPriority="46"/>
+    <w:lsdException w:name="List Table 2" w:uiPriority="47"/>
+    <w:lsdException w:name="List Table 3" w:uiPriority="48"/>
+    <w:lsdException w:name="List Table 4" w:uiPriority="49"/>
+    <w:lsdException w:name="List Table 5 Dark" w:uiPriority="50"/>
+    <w:lsdException w:name="List Table 6 Colorful" w:uiPriority="51"/>
+    <w:lsdException w:name="List Table 7 Colorful" w:uiPriority="52"/>
+    <w:lsdException w:name="List Table 1 Light Accent 1" w:uiPriority="46"/>
+    <w:lsdException w:name="List Table 2 Accent 1" w:uiPriority="47"/>
+    <w:lsdException w:name="List Table 3 Accent 1" w:uiPriority="48"/>
+    <w:lsdException w:name="List Table 4 Accent 1" w:uiPriority="49"/>
+    <w:lsdException w:name="List Table 5 Dark Accent 1" w:uiPriority="50"/>
+    <w:lsdException w:name="List Table 6 Colorful Accent 1" w:uiPriority="51"/>
+    <w:lsdException w:name="List Table 7 Colorful Accent 1" w:uiPriority="52"/>
+    <w:lsdException w:name="List Table 1 Light Accent 2" w:uiPriority="46"/>
+    <w:lsdException w:name="List Table 2 Accent 2" w:uiPriority="47"/>
+    <w:lsdException w:name="List Table 3 Accent 2" w:uiPriority="48"/>
+    <w:lsdException w:name="List Table 4 Accent 2" w:uiPriority="49"/>
+    <w:lsdException w:name="List Table 5 Dark Accent 2" w:uiPriority="50"/>
+    <w:lsdException w:name="List Table 6 Colorful Accent 2" w:uiPriority="51"/>
+    <w:lsdException w:name="List Table 7 Colorful Accent 2" w:uiPriority="52"/>
+    <w:lsdException w:name="List Table 1 Light Accent 3" w:uiPriority="46"/>
+    <w:lsdException w:name="List Table 2 Accent 3" w:uiPriority="47"/>
+    <w:lsdException w:name="List Table 3 Accent 3" w:uiPriority="48"/>
+    <w:lsdException w:name="List Table 4 Accent 3" w:uiPriority="49"/>
+    <w:lsdException w:name="List Table 5 Dark Accent 3" w:uiPriority="50"/>
+    <w:lsdException w:name="List Table 6 Colorful Accent 3" w:uiPriority="51"/>
+    <w:lsdException w:name="List Table 7 Colorful Accent 3" w:uiPriority="52"/>
+    <w:lsdException w:name="List Table 1 Light Accent 4" w:uiPriority="46"/>
+    <w:lsdException w:name="List Table 2 Accent 4" w:uiPriority="47"/>
+    <w:lsdException w:name="List Table 3 Accent 4" w:uiPriority="48"/>
+    <w:lsdException w:name="List Table 4 Accent 4" w:uiPriority="49"/>
+    <w:lsdException w:name="List Table 5 Dark Accent 4" w:uiPriority="50"/>
+    <w:lsdException w:name="List Table 6 Colorful Accent 4" w:uiPriority="51"/>
+    <w:lsdException w:name="List Table 7 Colorful Accent 4" w:uiPriority="52"/>
+    <w:lsdException w:name="List Table 1 Light Accent 5" w:uiPriority="46"/>
+    <w:lsdException w:name="List Table 2 Accent 5" w:uiPriority="47"/>
+    <w:lsdException w:name="List Table 3 Accent 5" w:uiPriority="48"/>
+    <w:lsdException w:name="List Table 4 Accent 5" w:uiPriority="49"/>
+    <w:lsdException w:name="List Table 5 Dark Accent 5" w:uiPriority="50"/>
+    <w:lsdException w:name="List Table 6 Colorful Accent 5" w:uiPriority="51"/>
+    <w:lsdException w:name="List Table 7 Colorful Accent 5" w:uiPriority="52"/>
+    <w:lsdException w:name="List Table 1 Light Accent 6" w:uiPriority="46"/>
+    <w:lsdException w:name="List Table 2 Accent 6" w:uiPriority="47"/>
+    <w:lsdException w:name="List Table 3 Accent 6" w:uiPriority="48"/>
+    <w:lsdException w:name="List Table 4 Accent 6" w:uiPriority="49"/>
+    <w:lsdException w:name="List Table 5 Dark Accent 6" w:uiPriority="50"/>
+    <w:lsdException w:name="List Table 6 Colorful Accent 6" w:uiPriority="51"/>
+    <w:lsdException w:name="List Table 7 Colorful Accent 6" w:uiPriority="52"/>
+    <w:lsdException w:name="Mention" w:semiHidden="1" w:unhideWhenUsed="1"/>
+    <w:lsdException w:name="Smart Hyperlink" w:semiHidden="1" w:unhideWhenUsed="1"/>
+    <w:lsdException w:name="Hashtag" w:semiHidden="1" w:unhideWhenUsed="1"/>
+    <w:lsdException w:name="Unresolved Mention" w:semiHidden="1" w:unhideWhenUsed="1"/>
+    <w:lsdException w:name="Smart Link" w:semiHidden="1" w:unhideWhenUsed="1"/>
+  </w:latentStyles>
+  <w:style w:type="paragraph" w:default="1" w:styleId="Normal">
+    <w:name w:val="Normal"/>
+    <w:qFormat/>
   </w:style>
   <w:style w:type="paragraph" w:styleId="Heading1">
     <w:name w:val="heading 1"/>
     <w:basedOn w:val="Normal"/>
     <w:next w:val="Normal"/>
+    <w:uiPriority w:val="9"/>
+    <w:qFormat/>
     <w:pPr>
-      <w:keepNext w:val="1"/>
-      <w:keepLines w:val="1"/>
-      <w:pageBreakBefore w:val="0"/>
-      <w:spacing w:after="120" w:before="400" w:lineRule="auto"/>
+      <w:keepNext/>
+      <w:keepLines/>
+      <w:spacing w:before="400" w:after="120"/>
+      <w:outlineLvl w:val="0"/>
     </w:pPr>
     <w:rPr>
       <w:sz w:val="40"/>
@@ -1785,15 +2059,16 @@
     <w:name w:val="heading 2"/>
     <w:basedOn w:val="Normal"/>
     <w:next w:val="Normal"/>
+    <w:uiPriority w:val="9"/>
+    <w:unhideWhenUsed/>
+    <w:qFormat/>
     <w:pPr>
-      <w:keepNext w:val="1"/>
-      <w:keepLines w:val="1"/>
-      <w:pageBreakBefore w:val="0"/>
-      <w:spacing w:after="120" w:before="360" w:lineRule="auto"/>
+      <w:keepNext/>
+      <w:keepLines/>
+      <w:spacing w:before="360" w:after="120"/>
+      <w:outlineLvl w:val="1"/>
     </w:pPr>
     <w:rPr>
-      <w:b w:val="0"/>
-      <w:bCs w:val="0"/>
       <w:sz w:val="32"/>
       <w:szCs w:val="32"/>
     </w:rPr>
@@ -1802,15 +2077,16 @@
     <w:name w:val="heading 3"/>
     <w:basedOn w:val="Normal"/>
     <w:next w:val="Normal"/>
+    <w:uiPriority w:val="9"/>
+    <w:unhideWhenUsed/>
+    <w:qFormat/>
     <w:pPr>
-      <w:keepNext w:val="1"/>
-      <w:keepLines w:val="1"/>
-      <w:pageBreakBefore w:val="0"/>
-      <w:spacing w:after="80" w:before="320" w:lineRule="auto"/>
+      <w:keepNext/>
+      <w:keepLines/>
+      <w:spacing w:before="320" w:after="80"/>
+      <w:outlineLvl w:val="2"/>
     </w:pPr>
     <w:rPr>
-      <w:b w:val="0"/>
-      <w:bCs w:val="0"/>
       <w:color w:val="434343"/>
       <w:sz w:val="28"/>
       <w:szCs w:val="28"/>
@@ -1820,11 +2096,15 @@
     <w:name w:val="heading 4"/>
     <w:basedOn w:val="Normal"/>
     <w:next w:val="Normal"/>
+    <w:uiPriority w:val="9"/>
+    <w:semiHidden/>
+    <w:unhideWhenUsed/>
+    <w:qFormat/>
     <w:pPr>
-      <w:keepNext w:val="1"/>
-      <w:keepLines w:val="1"/>
-      <w:pageBreakBefore w:val="0"/>
-      <w:spacing w:after="80" w:before="280" w:lineRule="auto"/>
+      <w:keepNext/>
+      <w:keepLines/>
+      <w:spacing w:before="280" w:after="80"/>
+      <w:outlineLvl w:val="3"/>
     </w:pPr>
     <w:rPr>
       <w:color w:val="666666"/>
@@ -1836,45 +2116,88 @@
     <w:name w:val="heading 5"/>
     <w:basedOn w:val="Normal"/>
     <w:next w:val="Normal"/>
+    <w:uiPriority w:val="9"/>
+    <w:semiHidden/>
+    <w:unhideWhenUsed/>
+    <w:qFormat/>
     <w:pPr>
-      <w:keepNext w:val="1"/>
-      <w:keepLines w:val="1"/>
-      <w:pageBreakBefore w:val="0"/>
-      <w:spacing w:after="80" w:before="240" w:lineRule="auto"/>
+      <w:keepNext/>
+      <w:keepLines/>
+      <w:spacing w:before="240" w:after="80"/>
+      <w:outlineLvl w:val="4"/>
     </w:pPr>
     <w:rPr>
       <w:color w:val="666666"/>
-      <w:sz w:val="22"/>
-      <w:szCs w:val="22"/>
     </w:rPr>
   </w:style>
   <w:style w:type="paragraph" w:styleId="Heading6">
     <w:name w:val="heading 6"/>
     <w:basedOn w:val="Normal"/>
     <w:next w:val="Normal"/>
+    <w:uiPriority w:val="9"/>
+    <w:semiHidden/>
+    <w:unhideWhenUsed/>
+    <w:qFormat/>
     <w:pPr>
-      <w:keepNext w:val="1"/>
-      <w:keepLines w:val="1"/>
-      <w:pageBreakBefore w:val="0"/>
-      <w:spacing w:after="80" w:before="240" w:lineRule="auto"/>
+      <w:keepNext/>
+      <w:keepLines/>
+      <w:spacing w:before="240" w:after="80"/>
+      <w:outlineLvl w:val="5"/>
     </w:pPr>
     <w:rPr>
-      <w:i w:val="1"/>
-      <w:iCs w:val="1"/>
+      <w:i/>
+      <w:iCs/>
       <w:color w:val="666666"/>
-      <w:sz w:val="22"/>
-      <w:szCs w:val="22"/>
     </w:rPr>
+  </w:style>
+  <w:style w:type="character" w:default="1" w:styleId="DefaultParagraphFont">
+    <w:name w:val="Default Paragraph Font"/>
+    <w:uiPriority w:val="1"/>
+    <w:semiHidden/>
+    <w:unhideWhenUsed/>
+  </w:style>
+  <w:style w:type="table" w:default="1" w:styleId="TableNormal">
+    <w:name w:val="Normal Table"/>
+    <w:uiPriority w:val="99"/>
+    <w:semiHidden/>
+    <w:unhideWhenUsed/>
+    <w:tblPr>
+      <w:tblInd w:w="0" w:type="dxa"/>
+      <w:tblCellMar>
+        <w:top w:w="0" w:type="dxa"/>
+        <w:left w:w="108" w:type="dxa"/>
+        <w:bottom w:w="0" w:type="dxa"/>
+        <w:right w:w="108" w:type="dxa"/>
+      </w:tblCellMar>
+    </w:tblPr>
+  </w:style>
+  <w:style w:type="numbering" w:default="1" w:styleId="NoList">
+    <w:name w:val="No List"/>
+    <w:uiPriority w:val="99"/>
+    <w:semiHidden/>
+    <w:unhideWhenUsed/>
+  </w:style>
+  <w:style w:type="table" w:customStyle="1" w:styleId="TableNormal0">
+    <w:name w:val="TableNormal"/>
+    <w:tblPr>
+      <w:tblCellMar>
+        <w:top w:w="100" w:type="dxa"/>
+        <w:left w:w="100" w:type="dxa"/>
+        <w:bottom w:w="100" w:type="dxa"/>
+        <w:right w:w="100" w:type="dxa"/>
+      </w:tblCellMar>
+    </w:tblPr>
   </w:style>
   <w:style w:type="paragraph" w:styleId="Title">
     <w:name w:val="Title"/>
     <w:basedOn w:val="Normal"/>
     <w:next w:val="Normal"/>
+    <w:uiPriority w:val="10"/>
+    <w:qFormat/>
     <w:pPr>
-      <w:keepNext w:val="1"/>
-      <w:keepLines w:val="1"/>
-      <w:pageBreakBefore w:val="0"/>
-      <w:spacing w:after="60" w:before="0" w:lineRule="auto"/>
+      <w:keepNext/>
+      <w:keepLines/>
+      <w:spacing w:after="60"/>
     </w:pPr>
     <w:rPr>
       <w:sz w:val="52"/>
@@ -1885,16 +2208,14 @@
     <w:name w:val="Subtitle"/>
     <w:basedOn w:val="Normal"/>
     <w:next w:val="Normal"/>
+    <w:uiPriority w:val="11"/>
+    <w:qFormat/>
     <w:pPr>
-      <w:keepNext w:val="1"/>
-      <w:keepLines w:val="1"/>
-      <w:pageBreakBefore w:val="0"/>
-      <w:spacing w:after="320" w:before="0" w:lineRule="auto"/>
+      <w:keepNext/>
+      <w:keepLines/>
+      <w:spacing w:after="320"/>
     </w:pPr>
     <w:rPr>
-      <w:rFonts w:ascii="Arial" w:cs="Arial" w:eastAsia="Arial" w:hAnsi="Arial"/>
-      <w:i w:val="0"/>
-      <w:iCs w:val="0"/>
       <w:color w:val="666666"/>
       <w:sz w:val="30"/>
       <w:szCs w:val="30"/>

</xml_diff>